<commit_message>
feat: improve journal and article experience
</commit_message>
<xml_diff>
--- a/frontend/public/templates/article-template.docx
+++ b/frontend/public/templates/article-template.docx
@@ -28,6 +28,8 @@
         <w:pStyle w:val="Balk1"/>
         <w:rPr>
           <w:rFonts w:ascii="Cambria" w:hAnsi="Cambria"/>
+          <w:b/>
+          <w:bCs/>
           <w:i/>
           <w:iCs/>
           <w:color w:val="EE0000"/>
@@ -36,134 +38,29 @@
           <w:lang w:val="en-US"/>
         </w:rPr>
       </w:pPr>
-      <w:proofErr w:type="spellStart"/>
       <w:r>
         <w:rPr>
           <w:rFonts w:ascii="Cambria" w:hAnsi="Cambria"/>
+          <w:b/>
+          <w:bCs/>
           <w:color w:val="auto"/>
           <w:sz w:val="30"/>
           <w:szCs w:val="30"/>
+          <w:lang w:val="en-US"/>
         </w:rPr>
         <w:t>Title</w:t>
       </w:r>
-      <w:proofErr w:type="spellEnd"/>
       <w:r>
         <w:rPr>
           <w:rFonts w:ascii="Cambria" w:hAnsi="Cambria"/>
+          <w:b/>
+          <w:bCs/>
           <w:color w:val="auto"/>
           <w:sz w:val="30"/>
           <w:szCs w:val="30"/>
-        </w:rPr>
-        <w:t xml:space="preserve"> </w:t>
-      </w:r>
-      <w:r>
-        <w:rPr>
-          <w:rFonts w:ascii="Cambria" w:hAnsi="Cambria"/>
-          <w:color w:val="auto"/>
-          <w:sz w:val="30"/>
-          <w:szCs w:val="30"/>
-        </w:rPr>
-        <w:t>(</w:t>
-      </w:r>
-      <w:proofErr w:type="spellStart"/>
-      <w:r>
-        <w:rPr>
-          <w:rFonts w:ascii="Cambria" w:hAnsi="Cambria"/>
-          <w:color w:val="EE0000"/>
-          <w:sz w:val="30"/>
-          <w:szCs w:val="30"/>
-        </w:rPr>
-        <w:t>Must</w:t>
-      </w:r>
-      <w:proofErr w:type="spellEnd"/>
-      <w:r>
-        <w:rPr>
-          <w:rFonts w:ascii="Cambria" w:hAnsi="Cambria"/>
-          <w:color w:val="EE0000"/>
-          <w:sz w:val="30"/>
-          <w:szCs w:val="30"/>
-        </w:rPr>
-        <w:t xml:space="preserve"> not </w:t>
-      </w:r>
-      <w:r>
-        <w:rPr>
-          <w:rFonts w:ascii="Cambria" w:hAnsi="Cambria"/>
-          <w:color w:val="EE0000"/>
-          <w:sz w:val="30"/>
-          <w:szCs w:val="30"/>
-        </w:rPr>
-        <w:t xml:space="preserve"> </w:t>
-      </w:r>
-      <w:proofErr w:type="spellStart"/>
-      <w:r>
-        <w:rPr>
-          <w:rFonts w:ascii="Cambria" w:hAnsi="Cambria"/>
-          <w:i/>
-          <w:iCs/>
-          <w:color w:val="EE0000"/>
-          <w:sz w:val="30"/>
-          <w:szCs w:val="30"/>
-        </w:rPr>
-        <w:t>exceed</w:t>
-      </w:r>
-      <w:proofErr w:type="spellEnd"/>
-      <w:r>
-        <w:rPr>
-          <w:rFonts w:ascii="Cambria" w:hAnsi="Cambria"/>
-          <w:i/>
-          <w:iCs/>
-          <w:color w:val="EE0000"/>
-          <w:sz w:val="30"/>
-          <w:szCs w:val="30"/>
-        </w:rPr>
-        <w:t xml:space="preserve"> </w:t>
-      </w:r>
-      <w:r>
-        <w:rPr>
-          <w:rFonts w:ascii="Cambria" w:hAnsi="Cambria"/>
-          <w:color w:val="EE0000"/>
-          <w:sz w:val="30"/>
-          <w:szCs w:val="30"/>
-        </w:rPr>
-        <w:t>1</w:t>
-      </w:r>
-      <w:r>
-        <w:rPr>
-          <w:rFonts w:ascii="Cambria" w:hAnsi="Cambria"/>
-          <w:color w:val="EE0000"/>
-          <w:sz w:val="30"/>
-          <w:szCs w:val="30"/>
-        </w:rPr>
-        <w:t>7</w:t>
-      </w:r>
-      <w:r>
-        <w:rPr>
-          <w:rFonts w:ascii="Cambria" w:hAnsi="Cambria"/>
-          <w:color w:val="EE0000"/>
-          <w:sz w:val="30"/>
-          <w:szCs w:val="30"/>
-        </w:rPr>
-        <w:t xml:space="preserve"> </w:t>
-      </w:r>
-      <w:proofErr w:type="spellStart"/>
-      <w:r>
-        <w:rPr>
-          <w:rFonts w:ascii="Cambria" w:hAnsi="Cambria"/>
-          <w:color w:val="EE0000"/>
-          <w:sz w:val="30"/>
-          <w:szCs w:val="30"/>
-        </w:rPr>
-        <w:t>words</w:t>
-      </w:r>
-      <w:proofErr w:type="spellEnd"/>
-      <w:r>
-        <w:rPr>
-          <w:rFonts w:ascii="Cambria" w:hAnsi="Cambria"/>
-          <w:color w:val="auto"/>
-          <w:sz w:val="30"/>
-          <w:szCs w:val="30"/>
-        </w:rPr>
-        <w:t>)</w:t>
+          <w:lang w:val="en-US"/>
+        </w:rPr>
+        <w:t>…</w:t>
       </w:r>
     </w:p>
     <w:p>
@@ -187,6 +84,9 @@
         </w:numPr>
         <w:spacing w:after="120"/>
         <w:jc w:val="both"/>
+        <w:rPr>
+          <w:lang w:val="en-US"/>
+        </w:rPr>
       </w:pPr>
       <w:r>
         <w:rPr>
@@ -202,7 +102,36 @@
           <w:rFonts w:ascii="Times New Roman" w:hAnsi="Times New Roman" w:cs="Times New Roman"/>
           <w:lang w:val="en-US"/>
         </w:rPr>
-        <w:t>Assist. Prof. Dr. – Istanbul Sabahattin Zaim University</w:t>
+        <w:t>Assist. Prof. Dr. –</w:t>
+      </w:r>
+      <w:r>
+        <w:rPr>
+          <w:rFonts w:ascii="Times New Roman" w:hAnsi="Times New Roman" w:cs="Times New Roman"/>
+          <w:lang w:val="en-US"/>
+        </w:rPr>
+        <w:t xml:space="preserve"> </w:t>
+      </w:r>
+      <w:r>
+        <w:rPr>
+          <w:rFonts w:ascii="Times New Roman" w:hAnsi="Times New Roman" w:cs="Times New Roman"/>
+          <w:lang w:val="en-US"/>
+        </w:rPr>
+        <w:t xml:space="preserve">Sample </w:t>
+      </w:r>
+      <w:r>
+        <w:rPr>
+          <w:rFonts w:ascii="Times New Roman" w:hAnsi="Times New Roman" w:cs="Times New Roman"/>
+          <w:lang w:val="en-US"/>
+        </w:rPr>
+        <w:t xml:space="preserve">University, Department of </w:t>
+      </w:r>
+      <w:proofErr w:type="gramStart"/>
+      <w:r>
+        <w:rPr>
+          <w:rFonts w:ascii="Times New Roman" w:hAnsi="Times New Roman" w:cs="Times New Roman"/>
+          <w:lang w:val="en-US"/>
+        </w:rPr>
+        <w:t xml:space="preserve">… </w:t>
       </w:r>
       <w:r>
         <w:rPr>
@@ -211,34 +140,7 @@
         </w:rPr>
         <w:t>,</w:t>
       </w:r>
-      <w:r>
-        <w:rPr>
-          <w:rFonts w:ascii="Times New Roman" w:hAnsi="Times New Roman" w:cs="Times New Roman"/>
-          <w:lang w:val="en-US"/>
-        </w:rPr>
-        <w:t xml:space="preserve"> Faculty of Health Sciences</w:t>
-      </w:r>
-      <w:r>
-        <w:rPr>
-          <w:rFonts w:ascii="Times New Roman" w:hAnsi="Times New Roman" w:cs="Times New Roman"/>
-          <w:lang w:val="en-US"/>
-        </w:rPr>
-        <w:t>,</w:t>
-      </w:r>
-      <w:r>
-        <w:rPr>
-          <w:rFonts w:ascii="Times New Roman" w:hAnsi="Times New Roman" w:cs="Times New Roman"/>
-          <w:lang w:val="en-US"/>
-        </w:rPr>
-        <w:t xml:space="preserve"> Department of Social Work</w:t>
-      </w:r>
-      <w:r>
-        <w:rPr>
-          <w:rFonts w:ascii="Times New Roman" w:hAnsi="Times New Roman" w:cs="Times New Roman"/>
-          <w:lang w:val="en-US"/>
-        </w:rPr>
-        <w:t>,</w:t>
-      </w:r>
+      <w:proofErr w:type="gramEnd"/>
       <w:r>
         <w:rPr>
           <w:rFonts w:ascii="Times New Roman" w:hAnsi="Times New Roman" w:cs="Times New Roman"/>
@@ -253,6 +155,9 @@
         <w:spacing w:after="120"/>
         <w:ind w:left="1068"/>
         <w:jc w:val="both"/>
+        <w:rPr>
+          <w:lang w:val="en-US"/>
+        </w:rPr>
       </w:pPr>
       <w:r>
         <w:rPr>
@@ -272,6 +177,9 @@
         </w:r>
       </w:hyperlink>
       <w:r>
+        <w:rPr>
+          <w:lang w:val="en-US"/>
+        </w:rPr>
         <w:t xml:space="preserve"> </w:t>
       </w:r>
     </w:p>
@@ -298,6 +206,9 @@
         </w:numPr>
         <w:spacing w:after="120"/>
         <w:jc w:val="both"/>
+        <w:rPr>
+          <w:lang w:val="en-US"/>
+        </w:rPr>
       </w:pPr>
       <w:r>
         <w:rPr>
@@ -313,7 +224,21 @@
           <w:rFonts w:ascii="Times New Roman" w:hAnsi="Times New Roman" w:cs="Times New Roman"/>
           <w:lang w:val="en-US"/>
         </w:rPr>
-        <w:t>Assist. Prof. Dr. – Istanbul Sabahattin Zaim University</w:t>
+        <w:t xml:space="preserve">Assist. Prof. Dr. – </w:t>
+      </w:r>
+      <w:r>
+        <w:rPr>
+          <w:rFonts w:ascii="Times New Roman" w:hAnsi="Times New Roman" w:cs="Times New Roman"/>
+          <w:lang w:val="en-US"/>
+        </w:rPr>
+        <w:t>Sample</w:t>
+      </w:r>
+      <w:r>
+        <w:rPr>
+          <w:rFonts w:ascii="Times New Roman" w:hAnsi="Times New Roman" w:cs="Times New Roman"/>
+          <w:lang w:val="en-US"/>
+        </w:rPr>
+        <w:t xml:space="preserve"> University</w:t>
       </w:r>
       <w:r>
         <w:rPr>
@@ -327,28 +252,14 @@
           <w:rFonts w:ascii="Times New Roman" w:hAnsi="Times New Roman" w:cs="Times New Roman"/>
           <w:lang w:val="en-US"/>
         </w:rPr>
-        <w:t xml:space="preserve"> Faculty of Health Sciences</w:t>
-      </w:r>
-      <w:r>
-        <w:rPr>
-          <w:rFonts w:ascii="Times New Roman" w:hAnsi="Times New Roman" w:cs="Times New Roman"/>
-          <w:lang w:val="en-US"/>
-        </w:rPr>
-        <w:t>,</w:t>
-      </w:r>
-      <w:r>
-        <w:rPr>
-          <w:rFonts w:ascii="Times New Roman" w:hAnsi="Times New Roman" w:cs="Times New Roman"/>
-          <w:lang w:val="en-US"/>
-        </w:rPr>
-        <w:t xml:space="preserve"> Department of Social Work</w:t>
-      </w:r>
-      <w:r>
-        <w:rPr>
-          <w:rFonts w:ascii="Times New Roman" w:hAnsi="Times New Roman" w:cs="Times New Roman"/>
-          <w:lang w:val="en-US"/>
-        </w:rPr>
-        <w:t>,</w:t>
+        <w:t xml:space="preserve"> Department of </w:t>
+      </w:r>
+      <w:r>
+        <w:rPr>
+          <w:rFonts w:ascii="Times New Roman" w:hAnsi="Times New Roman" w:cs="Times New Roman"/>
+          <w:lang w:val="en-US"/>
+        </w:rPr>
+        <w:t>…,</w:t>
       </w:r>
       <w:r>
         <w:rPr>
@@ -364,6 +275,9 @@
         <w:spacing w:after="120"/>
         <w:ind w:left="1068"/>
         <w:jc w:val="both"/>
+        <w:rPr>
+          <w:lang w:val="en-US"/>
+        </w:rPr>
       </w:pPr>
       <w:r>
         <w:rPr>
@@ -576,7 +490,7 @@
           <w:bCs/>
           <w:lang w:val="en-US"/>
         </w:rPr>
-        <w:t>0</w:t>
+        <w:t>5</w:t>
       </w:r>
       <w:r>
         <w:rPr>
@@ -702,7 +616,7 @@
           <w:szCs w:val="22"/>
           <w:lang w:val="en-US"/>
         </w:rPr>
-        <w:t>: 12.04.2026</w:t>
+        <w:t xml:space="preserve">: </w:t>
       </w:r>
       <w:r>
         <w:rPr>
@@ -728,7 +642,7 @@
           <w:szCs w:val="22"/>
           <w:lang w:val="en-US"/>
         </w:rPr>
-        <w:t>: 29.04.2026</w:t>
+        <w:t xml:space="preserve">: </w:t>
       </w:r>
       <w:r>
         <w:rPr>
@@ -754,7 +668,25 @@
           <w:szCs w:val="22"/>
           <w:lang w:val="en-US"/>
         </w:rPr>
-        <w:t>: scd000021/4455</w:t>
+        <w:t xml:space="preserve">: </w:t>
+      </w:r>
+      <w:proofErr w:type="spellStart"/>
+      <w:r>
+        <w:rPr>
+          <w:sz w:val="22"/>
+          <w:szCs w:val="22"/>
+          <w:lang w:val="en-US"/>
+        </w:rPr>
+        <w:t>scd</w:t>
+      </w:r>
+      <w:proofErr w:type="spellEnd"/>
+      <w:r>
+        <w:rPr>
+          <w:sz w:val="22"/>
+          <w:szCs w:val="22"/>
+          <w:lang w:val="en-US"/>
+        </w:rPr>
+        <w:t>…</w:t>
       </w:r>
     </w:p>
     <w:p>
@@ -783,7 +715,7 @@
           <w:szCs w:val="22"/>
           <w:lang w:val="en-US"/>
         </w:rPr>
-        <w:t>: 10</w:t>
+        <w:t xml:space="preserve">: </w:t>
       </w:r>
       <w:r>
         <w:rPr>
@@ -809,7 +741,7 @@
           <w:szCs w:val="22"/>
           <w:lang w:val="en-US"/>
         </w:rPr>
-        <w:t>: 1</w:t>
+        <w:t xml:space="preserve">: </w:t>
       </w:r>
       <w:r>
         <w:rPr>
@@ -835,58 +767,68 @@
           <w:szCs w:val="22"/>
           <w:lang w:val="en-US"/>
         </w:rPr>
-        <w:t>: 2026</w:t>
-      </w:r>
-    </w:p>
-    <w:p>
-      <w:pPr>
-        <w:spacing w:after="120"/>
-        <w:jc w:val="both"/>
-        <w:rPr>
-          <w:rFonts w:ascii="Times New Roman" w:hAnsi="Times New Roman" w:cs="Times New Roman"/>
-          <w:b/>
-          <w:bCs/>
-          <w:lang w:val="en-US"/>
-        </w:rPr>
-      </w:pPr>
-    </w:p>
-    <w:p>
-      <w:pPr>
-        <w:spacing w:after="120"/>
-        <w:jc w:val="both"/>
-        <w:rPr>
-          <w:rFonts w:ascii="Times New Roman" w:hAnsi="Times New Roman" w:cs="Times New Roman"/>
-          <w:b/>
-          <w:bCs/>
-          <w:lang w:val="en-US"/>
-        </w:rPr>
-      </w:pPr>
-    </w:p>
-    <w:p>
-      <w:pPr>
-        <w:spacing w:after="120"/>
-        <w:jc w:val="both"/>
-        <w:rPr>
-          <w:rFonts w:ascii="Times New Roman" w:hAnsi="Times New Roman" w:cs="Times New Roman"/>
-          <w:lang w:val="en-US"/>
-        </w:rPr>
-      </w:pPr>
-      <w:r>
-        <w:rPr>
-          <w:rFonts w:ascii="Times New Roman" w:hAnsi="Times New Roman" w:cs="Times New Roman"/>
-          <w:b/>
-          <w:bCs/>
-          <w:lang w:val="en-US"/>
-        </w:rPr>
-        <w:t xml:space="preserve">Cite as: </w:t>
-      </w:r>
-      <w:r>
-        <w:rPr>
-          <w:rFonts w:ascii="Times New Roman" w:hAnsi="Times New Roman" w:cs="Times New Roman"/>
-          <w:lang w:val="en-US"/>
-        </w:rPr>
-        <w:t xml:space="preserve">Surname, F. &amp; Surname, F. </w:t>
-      </w:r>
+        <w:t xml:space="preserve">: </w:t>
+      </w:r>
+    </w:p>
+    <w:p>
+      <w:pPr>
+        <w:spacing w:after="120"/>
+        <w:jc w:val="both"/>
+        <w:rPr>
+          <w:rFonts w:ascii="Times New Roman" w:hAnsi="Times New Roman" w:cs="Times New Roman"/>
+          <w:b/>
+          <w:bCs/>
+          <w:lang w:val="en-US"/>
+        </w:rPr>
+      </w:pPr>
+    </w:p>
+    <w:p>
+      <w:pPr>
+        <w:spacing w:after="120"/>
+        <w:jc w:val="both"/>
+        <w:rPr>
+          <w:rFonts w:ascii="Times New Roman" w:hAnsi="Times New Roman" w:cs="Times New Roman"/>
+          <w:b/>
+          <w:bCs/>
+          <w:lang w:val="en-US"/>
+        </w:rPr>
+      </w:pPr>
+    </w:p>
+    <w:p>
+      <w:pPr>
+        <w:spacing w:after="120"/>
+        <w:jc w:val="both"/>
+        <w:rPr>
+          <w:rFonts w:ascii="Times New Roman" w:hAnsi="Times New Roman" w:cs="Times New Roman"/>
+          <w:b/>
+          <w:bCs/>
+          <w:lang w:val="en-US"/>
+        </w:rPr>
+      </w:pPr>
+    </w:p>
+    <w:p>
+      <w:pPr>
+        <w:spacing w:after="120"/>
+        <w:jc w:val="both"/>
+        <w:rPr>
+          <w:rFonts w:ascii="Times New Roman" w:hAnsi="Times New Roman" w:cs="Times New Roman"/>
+          <w:b/>
+          <w:bCs/>
+          <w:lang w:val="en-US"/>
+        </w:rPr>
+      </w:pPr>
+    </w:p>
+    <w:p>
+      <w:pPr>
+        <w:spacing w:after="120"/>
+        <w:jc w:val="both"/>
+        <w:rPr>
+          <w:rFonts w:ascii="Times New Roman" w:hAnsi="Times New Roman" w:cs="Times New Roman"/>
+          <w:b/>
+          <w:bCs/>
+          <w:lang w:val="en-US"/>
+        </w:rPr>
+      </w:pPr>
     </w:p>
     <w:p>
       <w:pPr>
@@ -1081,16 +1023,7 @@
           <w:bCs/>
           <w:lang w:val="en-US"/>
         </w:rPr>
-        <w:t>METHODOLOGY</w:t>
-      </w:r>
-      <w:r>
-        <w:rPr>
-          <w:rFonts w:ascii="Times New Roman" w:hAnsi="Times New Roman" w:cs="Times New Roman"/>
-          <w:b/>
-          <w:bCs/>
-          <w:lang w:val="en-US"/>
-        </w:rPr>
-        <w:t xml:space="preserve"> AND PROCEDURE</w:t>
+        <w:t>METHODOLOGY AND PROCEDURE</w:t>
       </w:r>
     </w:p>
     <w:p>
@@ -1120,16 +1053,7 @@
           <w:bCs/>
           <w:lang w:val="en-US"/>
         </w:rPr>
-        <w:t>.1.</w:t>
-      </w:r>
-      <w:r>
-        <w:rPr>
-          <w:rFonts w:ascii="Times New Roman" w:hAnsi="Times New Roman" w:cs="Times New Roman"/>
-          <w:b/>
-          <w:bCs/>
-          <w:lang w:val="en-US"/>
-        </w:rPr>
-        <w:t xml:space="preserve"> </w:t>
+        <w:t xml:space="preserve">.1. </w:t>
       </w:r>
       <w:r>
         <w:rPr>
@@ -1175,16 +1099,7 @@
           <w:bCs/>
           <w:lang w:val="en-US"/>
         </w:rPr>
-        <w:t xml:space="preserve">3.2. </w:t>
-      </w:r>
-      <w:r>
-        <w:rPr>
-          <w:rFonts w:ascii="Times New Roman" w:hAnsi="Times New Roman" w:cs="Times New Roman"/>
-          <w:b/>
-          <w:bCs/>
-          <w:lang w:val="en-US"/>
-        </w:rPr>
-        <w:t xml:space="preserve">Data </w:t>
+        <w:t xml:space="preserve">3.2. Data </w:t>
       </w:r>
       <w:r>
         <w:rPr>
@@ -1288,46 +1203,28 @@
           <w:bCs/>
           <w:lang w:val="en-US"/>
         </w:rPr>
-        <w:t xml:space="preserve">4. </w:t>
-      </w:r>
-      <w:r>
-        <w:rPr>
-          <w:rFonts w:ascii="Times New Roman" w:hAnsi="Times New Roman" w:cs="Times New Roman"/>
-          <w:b/>
-          <w:bCs/>
-          <w:lang w:val="en-US"/>
-        </w:rPr>
-        <w:t>RESULTS</w:t>
-      </w:r>
-    </w:p>
-    <w:p>
-      <w:pPr>
-        <w:spacing w:after="120"/>
-        <w:jc w:val="both"/>
-        <w:rPr>
-          <w:rFonts w:ascii="Times New Roman" w:hAnsi="Times New Roman" w:cs="Times New Roman"/>
-          <w:b/>
-          <w:bCs/>
-          <w:lang w:val="en-US"/>
-        </w:rPr>
-      </w:pPr>
-      <w:r>
-        <w:rPr>
-          <w:rFonts w:ascii="Times New Roman" w:hAnsi="Times New Roman" w:cs="Times New Roman"/>
-          <w:b/>
-          <w:bCs/>
-          <w:lang w:val="en-US"/>
-        </w:rPr>
-        <w:t xml:space="preserve">5. </w:t>
-      </w:r>
-      <w:r>
-        <w:rPr>
-          <w:rFonts w:ascii="Times New Roman" w:hAnsi="Times New Roman" w:cs="Times New Roman"/>
-          <w:b/>
-          <w:bCs/>
-          <w:lang w:val="en-US"/>
-        </w:rPr>
-        <w:t>DISCUSSION</w:t>
+        <w:t>4. RESULTS</w:t>
+      </w:r>
+    </w:p>
+    <w:p>
+      <w:pPr>
+        <w:spacing w:after="120"/>
+        <w:jc w:val="both"/>
+        <w:rPr>
+          <w:rFonts w:ascii="Times New Roman" w:hAnsi="Times New Roman" w:cs="Times New Roman"/>
+          <w:b/>
+          <w:bCs/>
+          <w:lang w:val="en-US"/>
+        </w:rPr>
+      </w:pPr>
+      <w:r>
+        <w:rPr>
+          <w:rFonts w:ascii="Times New Roman" w:hAnsi="Times New Roman" w:cs="Times New Roman"/>
+          <w:b/>
+          <w:bCs/>
+          <w:lang w:val="en-US"/>
+        </w:rPr>
+        <w:t>5. DISCUSSION</w:t>
       </w:r>
     </w:p>
     <w:p>
@@ -1506,13 +1403,110 @@
           <w:lang w:val="en-US"/>
         </w:rPr>
       </w:pPr>
-      <w:r>
-        <w:rPr>
-          <w:rFonts w:ascii="Times New Roman" w:hAnsi="Times New Roman" w:cs="Times New Roman"/>
-          <w:b/>
-          <w:bCs/>
-          <w:lang w:val="en-US"/>
-        </w:rPr>
+    </w:p>
+    <w:p>
+      <w:pPr>
+        <w:spacing w:after="120"/>
+        <w:jc w:val="both"/>
+        <w:rPr>
+          <w:rFonts w:ascii="Times New Roman" w:hAnsi="Times New Roman" w:cs="Times New Roman"/>
+          <w:b/>
+          <w:bCs/>
+          <w:lang w:val="en-US"/>
+        </w:rPr>
+      </w:pPr>
+    </w:p>
+    <w:p>
+      <w:pPr>
+        <w:spacing w:after="120"/>
+        <w:jc w:val="both"/>
+        <w:rPr>
+          <w:rFonts w:ascii="Times New Roman" w:hAnsi="Times New Roman" w:cs="Times New Roman"/>
+          <w:b/>
+          <w:bCs/>
+          <w:lang w:val="en-US"/>
+        </w:rPr>
+      </w:pPr>
+    </w:p>
+    <w:p>
+      <w:pPr>
+        <w:spacing w:after="120"/>
+        <w:jc w:val="both"/>
+        <w:rPr>
+          <w:rFonts w:ascii="Times New Roman" w:hAnsi="Times New Roman" w:cs="Times New Roman"/>
+          <w:b/>
+          <w:bCs/>
+          <w:lang w:val="en-US"/>
+        </w:rPr>
+      </w:pPr>
+    </w:p>
+    <w:p>
+      <w:pPr>
+        <w:spacing w:after="120"/>
+        <w:jc w:val="both"/>
+        <w:rPr>
+          <w:rFonts w:ascii="Times New Roman" w:hAnsi="Times New Roman" w:cs="Times New Roman"/>
+          <w:b/>
+          <w:bCs/>
+          <w:lang w:val="en-US"/>
+        </w:rPr>
+      </w:pPr>
+    </w:p>
+    <w:p>
+      <w:pPr>
+        <w:spacing w:after="120"/>
+        <w:jc w:val="both"/>
+        <w:rPr>
+          <w:rFonts w:ascii="Times New Roman" w:hAnsi="Times New Roman" w:cs="Times New Roman"/>
+          <w:b/>
+          <w:bCs/>
+          <w:lang w:val="en-US"/>
+        </w:rPr>
+      </w:pPr>
+    </w:p>
+    <w:p>
+      <w:pPr>
+        <w:spacing w:after="120"/>
+        <w:jc w:val="both"/>
+        <w:rPr>
+          <w:rFonts w:ascii="Times New Roman" w:hAnsi="Times New Roman" w:cs="Times New Roman"/>
+          <w:b/>
+          <w:bCs/>
+          <w:lang w:val="en-US"/>
+        </w:rPr>
+      </w:pPr>
+    </w:p>
+    <w:p>
+      <w:pPr>
+        <w:spacing w:after="120"/>
+        <w:jc w:val="both"/>
+        <w:rPr>
+          <w:rFonts w:ascii="Times New Roman" w:hAnsi="Times New Roman" w:cs="Times New Roman"/>
+          <w:b/>
+          <w:bCs/>
+          <w:lang w:val="en-US"/>
+        </w:rPr>
+      </w:pPr>
+    </w:p>
+    <w:p>
+      <w:pPr>
+        <w:spacing w:after="120"/>
+        <w:jc w:val="both"/>
+        <w:rPr>
+          <w:rFonts w:ascii="Times New Roman" w:hAnsi="Times New Roman" w:cs="Times New Roman"/>
+          <w:b/>
+          <w:bCs/>
+          <w:lang w:val="en-US"/>
+        </w:rPr>
+      </w:pPr>
+      <w:r>
+        <w:rPr>
+          <w:rFonts w:ascii="Times New Roman" w:hAnsi="Times New Roman" w:cs="Times New Roman"/>
+          <w:b/>
+          <w:bCs/>
+          <w:lang w:val="en-US"/>
+        </w:rPr>
+        <w:lastRenderedPageBreak/>
         <w:t>Conflict of Interest</w:t>
       </w:r>
       <w:r>
@@ -1522,16 +1516,7 @@
           <w:bCs/>
           <w:lang w:val="en-US"/>
         </w:rPr>
-        <w:t xml:space="preserve"> </w:t>
-      </w:r>
-      <w:r>
-        <w:rPr>
-          <w:rFonts w:ascii="Times New Roman" w:hAnsi="Times New Roman" w:cs="Times New Roman"/>
-          <w:b/>
-          <w:bCs/>
-          <w:lang w:val="en-US"/>
-        </w:rPr>
-        <w:t>(</w:t>
+        <w:t xml:space="preserve"> (</w:t>
       </w:r>
       <w:r>
         <w:rPr>
@@ -1590,16 +1575,7 @@
           <w:bCs/>
           <w:lang w:val="en-US"/>
         </w:rPr>
-        <w:t xml:space="preserve"> </w:t>
-      </w:r>
-      <w:r>
-        <w:rPr>
-          <w:rFonts w:ascii="Times New Roman" w:hAnsi="Times New Roman" w:cs="Times New Roman"/>
-          <w:b/>
-          <w:bCs/>
-          <w:lang w:val="en-US"/>
-        </w:rPr>
-        <w:t>(</w:t>
+        <w:t xml:space="preserve"> (</w:t>
       </w:r>
       <w:r>
         <w:rPr>
@@ -1657,7 +1633,7 @@
           <w:color w:val="FF0000"/>
           <w:lang w:val="en-US"/>
         </w:rPr>
-        <w:t xml:space="preserve">Ethics approval is required for research articles. </w:t>
+        <w:t>Ethics approval is required for research articles. If ethics approval is not required, please provide a statement of ethical compliance.</w:t>
       </w:r>
     </w:p>
     <w:p>
@@ -1754,7 +1730,6 @@
           <w:bCs/>
           <w:lang w:val="en-US"/>
         </w:rPr>
-        <w:lastRenderedPageBreak/>
         <w:t>Author Contributions (</w:t>
       </w:r>
       <w:r>
@@ -1795,6 +1770,7 @@
           <w:bCs w:val="0"/>
           <w:sz w:val="22"/>
           <w:szCs w:val="22"/>
+          <w:lang w:val="en-US"/>
         </w:rPr>
       </w:pPr>
       <w:r>
@@ -1802,6 +1778,7 @@
           <w:rStyle w:val="Gl"/>
           <w:sz w:val="22"/>
           <w:szCs w:val="22"/>
+          <w:lang w:val="en-US"/>
         </w:rPr>
         <w:t xml:space="preserve">Author </w:t>
       </w:r>
@@ -1810,6 +1787,7 @@
           <w:rStyle w:val="Gl"/>
           <w:sz w:val="22"/>
           <w:szCs w:val="22"/>
+          <w:lang w:val="en-US"/>
         </w:rPr>
         <w:t>Name</w:t>
       </w:r>
@@ -1818,10 +1796,10 @@
           <w:rStyle w:val="Gl"/>
           <w:sz w:val="22"/>
           <w:szCs w:val="22"/>
+          <w:lang w:val="en-US"/>
         </w:rPr>
         <w:t xml:space="preserve">: </w:t>
       </w:r>
-      <w:proofErr w:type="spellStart"/>
       <w:r>
         <w:rPr>
           <w:rStyle w:val="Gl"/>
@@ -1829,481 +1807,9 @@
           <w:bCs w:val="0"/>
           <w:sz w:val="22"/>
           <w:szCs w:val="22"/>
-        </w:rPr>
-        <w:t>Responsible</w:t>
-      </w:r>
-      <w:proofErr w:type="spellEnd"/>
-      <w:r>
-        <w:rPr>
-          <w:rStyle w:val="Gl"/>
-          <w:b w:val="0"/>
-          <w:bCs w:val="0"/>
-          <w:sz w:val="22"/>
-          <w:szCs w:val="22"/>
-        </w:rPr>
-        <w:t xml:space="preserve"> </w:t>
-      </w:r>
-      <w:proofErr w:type="spellStart"/>
-      <w:r>
-        <w:rPr>
-          <w:rStyle w:val="Gl"/>
-          <w:b w:val="0"/>
-          <w:bCs w:val="0"/>
-          <w:sz w:val="22"/>
-          <w:szCs w:val="22"/>
-        </w:rPr>
-        <w:t>for</w:t>
-      </w:r>
-      <w:proofErr w:type="spellEnd"/>
-      <w:r>
-        <w:rPr>
-          <w:rStyle w:val="Gl"/>
-          <w:b w:val="0"/>
-          <w:bCs w:val="0"/>
-          <w:sz w:val="22"/>
-          <w:szCs w:val="22"/>
-        </w:rPr>
-        <w:t xml:space="preserve"> </w:t>
-      </w:r>
-      <w:proofErr w:type="spellStart"/>
-      <w:r>
-        <w:rPr>
-          <w:rStyle w:val="Gl"/>
-          <w:b w:val="0"/>
-          <w:bCs w:val="0"/>
-          <w:sz w:val="22"/>
-          <w:szCs w:val="22"/>
-        </w:rPr>
-        <w:t>the</w:t>
-      </w:r>
-      <w:proofErr w:type="spellEnd"/>
-      <w:r>
-        <w:rPr>
-          <w:rStyle w:val="Gl"/>
-          <w:b w:val="0"/>
-          <w:bCs w:val="0"/>
-          <w:sz w:val="22"/>
-          <w:szCs w:val="22"/>
-        </w:rPr>
-        <w:t xml:space="preserve"> </w:t>
-      </w:r>
-      <w:proofErr w:type="spellStart"/>
-      <w:r>
-        <w:rPr>
-          <w:rStyle w:val="Gl"/>
-          <w:b w:val="0"/>
-          <w:bCs w:val="0"/>
-          <w:sz w:val="22"/>
-          <w:szCs w:val="22"/>
-        </w:rPr>
-        <w:t>conceptualization</w:t>
-      </w:r>
-      <w:proofErr w:type="spellEnd"/>
-      <w:r>
-        <w:rPr>
-          <w:rStyle w:val="Gl"/>
-          <w:b w:val="0"/>
-          <w:bCs w:val="0"/>
-          <w:sz w:val="22"/>
-          <w:szCs w:val="22"/>
-        </w:rPr>
-        <w:t xml:space="preserve"> of </w:t>
-      </w:r>
-      <w:proofErr w:type="spellStart"/>
-      <w:r>
-        <w:rPr>
-          <w:rStyle w:val="Gl"/>
-          <w:b w:val="0"/>
-          <w:bCs w:val="0"/>
-          <w:sz w:val="22"/>
-          <w:szCs w:val="22"/>
-        </w:rPr>
-        <w:t>the</w:t>
-      </w:r>
-      <w:proofErr w:type="spellEnd"/>
-      <w:r>
-        <w:rPr>
-          <w:rStyle w:val="Gl"/>
-          <w:b w:val="0"/>
-          <w:bCs w:val="0"/>
-          <w:sz w:val="22"/>
-          <w:szCs w:val="22"/>
-        </w:rPr>
-        <w:t xml:space="preserve"> </w:t>
-      </w:r>
-      <w:proofErr w:type="spellStart"/>
-      <w:r>
-        <w:rPr>
-          <w:rStyle w:val="Gl"/>
-          <w:b w:val="0"/>
-          <w:bCs w:val="0"/>
-          <w:sz w:val="22"/>
-          <w:szCs w:val="22"/>
-        </w:rPr>
-        <w:t>study</w:t>
-      </w:r>
-      <w:proofErr w:type="spellEnd"/>
-      <w:r>
-        <w:rPr>
-          <w:rStyle w:val="Gl"/>
-          <w:b w:val="0"/>
-          <w:bCs w:val="0"/>
-          <w:sz w:val="22"/>
-          <w:szCs w:val="22"/>
-        </w:rPr>
-        <w:t xml:space="preserve">, </w:t>
-      </w:r>
-      <w:proofErr w:type="spellStart"/>
-      <w:r>
-        <w:rPr>
-          <w:rStyle w:val="Gl"/>
-          <w:b w:val="0"/>
-          <w:bCs w:val="0"/>
-          <w:sz w:val="22"/>
-          <w:szCs w:val="22"/>
-        </w:rPr>
-        <w:t>research</w:t>
-      </w:r>
-      <w:proofErr w:type="spellEnd"/>
-      <w:r>
-        <w:rPr>
-          <w:rStyle w:val="Gl"/>
-          <w:b w:val="0"/>
-          <w:bCs w:val="0"/>
-          <w:sz w:val="22"/>
-          <w:szCs w:val="22"/>
-        </w:rPr>
-        <w:t xml:space="preserve"> </w:t>
-      </w:r>
-      <w:proofErr w:type="spellStart"/>
-      <w:r>
-        <w:rPr>
-          <w:rStyle w:val="Gl"/>
-          <w:b w:val="0"/>
-          <w:bCs w:val="0"/>
-          <w:sz w:val="22"/>
-          <w:szCs w:val="22"/>
-        </w:rPr>
-        <w:t>design</w:t>
-      </w:r>
-      <w:proofErr w:type="spellEnd"/>
-      <w:r>
-        <w:rPr>
-          <w:rStyle w:val="Gl"/>
-          <w:b w:val="0"/>
-          <w:bCs w:val="0"/>
-          <w:sz w:val="22"/>
-          <w:szCs w:val="22"/>
-        </w:rPr>
-        <w:t xml:space="preserve">, </w:t>
-      </w:r>
-      <w:proofErr w:type="spellStart"/>
-      <w:r>
-        <w:rPr>
-          <w:rStyle w:val="Gl"/>
-          <w:b w:val="0"/>
-          <w:bCs w:val="0"/>
-          <w:sz w:val="22"/>
-          <w:szCs w:val="22"/>
-        </w:rPr>
-        <w:t>planning</w:t>
-      </w:r>
-      <w:proofErr w:type="spellEnd"/>
-      <w:r>
-        <w:rPr>
-          <w:rStyle w:val="Gl"/>
-          <w:b w:val="0"/>
-          <w:bCs w:val="0"/>
-          <w:sz w:val="22"/>
-          <w:szCs w:val="22"/>
-        </w:rPr>
-        <w:t xml:space="preserve"> of </w:t>
-      </w:r>
-      <w:proofErr w:type="spellStart"/>
-      <w:r>
-        <w:rPr>
-          <w:rStyle w:val="Gl"/>
-          <w:b w:val="0"/>
-          <w:bCs w:val="0"/>
-          <w:sz w:val="22"/>
-          <w:szCs w:val="22"/>
-        </w:rPr>
-        <w:t>the</w:t>
-      </w:r>
-      <w:proofErr w:type="spellEnd"/>
-      <w:r>
-        <w:rPr>
-          <w:rStyle w:val="Gl"/>
-          <w:b w:val="0"/>
-          <w:bCs w:val="0"/>
-          <w:sz w:val="22"/>
-          <w:szCs w:val="22"/>
-        </w:rPr>
-        <w:t xml:space="preserve"> </w:t>
-      </w:r>
-      <w:proofErr w:type="gramStart"/>
-      <w:r>
-        <w:rPr>
-          <w:rStyle w:val="Gl"/>
-          <w:b w:val="0"/>
-          <w:bCs w:val="0"/>
-          <w:sz w:val="22"/>
-          <w:szCs w:val="22"/>
-        </w:rPr>
-        <w:t>data</w:t>
-      </w:r>
-      <w:proofErr w:type="gramEnd"/>
-      <w:r>
-        <w:rPr>
-          <w:rStyle w:val="Gl"/>
-          <w:b w:val="0"/>
-          <w:bCs w:val="0"/>
-          <w:sz w:val="22"/>
-          <w:szCs w:val="22"/>
-        </w:rPr>
-        <w:t xml:space="preserve"> </w:t>
-      </w:r>
-      <w:proofErr w:type="spellStart"/>
-      <w:r>
-        <w:rPr>
-          <w:rStyle w:val="Gl"/>
-          <w:b w:val="0"/>
-          <w:bCs w:val="0"/>
-          <w:sz w:val="22"/>
-          <w:szCs w:val="22"/>
-        </w:rPr>
-        <w:t>collection</w:t>
-      </w:r>
-      <w:proofErr w:type="spellEnd"/>
-      <w:r>
-        <w:rPr>
-          <w:rStyle w:val="Gl"/>
-          <w:b w:val="0"/>
-          <w:bCs w:val="0"/>
-          <w:sz w:val="22"/>
-          <w:szCs w:val="22"/>
-        </w:rPr>
-        <w:t xml:space="preserve"> </w:t>
-      </w:r>
-      <w:proofErr w:type="spellStart"/>
-      <w:r>
-        <w:rPr>
-          <w:rStyle w:val="Gl"/>
-          <w:b w:val="0"/>
-          <w:bCs w:val="0"/>
-          <w:sz w:val="22"/>
-          <w:szCs w:val="22"/>
-        </w:rPr>
-        <w:t>process</w:t>
-      </w:r>
-      <w:proofErr w:type="spellEnd"/>
-      <w:r>
-        <w:rPr>
-          <w:rStyle w:val="Gl"/>
-          <w:b w:val="0"/>
-          <w:bCs w:val="0"/>
-          <w:sz w:val="22"/>
-          <w:szCs w:val="22"/>
-        </w:rPr>
-        <w:t xml:space="preserve">, </w:t>
-      </w:r>
-      <w:proofErr w:type="gramStart"/>
-      <w:r>
-        <w:rPr>
-          <w:rStyle w:val="Gl"/>
-          <w:b w:val="0"/>
-          <w:bCs w:val="0"/>
-          <w:sz w:val="22"/>
-          <w:szCs w:val="22"/>
-        </w:rPr>
-        <w:t>data</w:t>
-      </w:r>
-      <w:proofErr w:type="gramEnd"/>
-      <w:r>
-        <w:rPr>
-          <w:rStyle w:val="Gl"/>
-          <w:b w:val="0"/>
-          <w:bCs w:val="0"/>
-          <w:sz w:val="22"/>
-          <w:szCs w:val="22"/>
-        </w:rPr>
-        <w:t xml:space="preserve"> </w:t>
-      </w:r>
-      <w:proofErr w:type="spellStart"/>
-      <w:r>
-        <w:rPr>
-          <w:rStyle w:val="Gl"/>
-          <w:b w:val="0"/>
-          <w:bCs w:val="0"/>
-          <w:sz w:val="22"/>
-          <w:szCs w:val="22"/>
-        </w:rPr>
-        <w:t>analysis</w:t>
-      </w:r>
-      <w:proofErr w:type="spellEnd"/>
-      <w:r>
-        <w:rPr>
-          <w:rStyle w:val="Gl"/>
-          <w:b w:val="0"/>
-          <w:bCs w:val="0"/>
-          <w:sz w:val="22"/>
-          <w:szCs w:val="22"/>
-        </w:rPr>
-        <w:t xml:space="preserve">, </w:t>
-      </w:r>
-      <w:proofErr w:type="spellStart"/>
-      <w:r>
-        <w:rPr>
-          <w:rStyle w:val="Gl"/>
-          <w:b w:val="0"/>
-          <w:bCs w:val="0"/>
-          <w:sz w:val="22"/>
-          <w:szCs w:val="22"/>
-        </w:rPr>
-        <w:t>and</w:t>
-      </w:r>
-      <w:proofErr w:type="spellEnd"/>
-      <w:r>
-        <w:rPr>
-          <w:rStyle w:val="Gl"/>
-          <w:b w:val="0"/>
-          <w:bCs w:val="0"/>
-          <w:sz w:val="22"/>
-          <w:szCs w:val="22"/>
-        </w:rPr>
-        <w:t xml:space="preserve"> </w:t>
-      </w:r>
-      <w:proofErr w:type="spellStart"/>
-      <w:r>
-        <w:rPr>
-          <w:rStyle w:val="Gl"/>
-          <w:b w:val="0"/>
-          <w:bCs w:val="0"/>
-          <w:sz w:val="22"/>
-          <w:szCs w:val="22"/>
-        </w:rPr>
-        <w:t>writing</w:t>
-      </w:r>
-      <w:proofErr w:type="spellEnd"/>
-      <w:r>
-        <w:rPr>
-          <w:rStyle w:val="Gl"/>
-          <w:b w:val="0"/>
-          <w:bCs w:val="0"/>
-          <w:sz w:val="22"/>
-          <w:szCs w:val="22"/>
-        </w:rPr>
-        <w:t xml:space="preserve"> </w:t>
-      </w:r>
-      <w:proofErr w:type="spellStart"/>
-      <w:r>
-        <w:rPr>
-          <w:rStyle w:val="Gl"/>
-          <w:b w:val="0"/>
-          <w:bCs w:val="0"/>
-          <w:sz w:val="22"/>
-          <w:szCs w:val="22"/>
-        </w:rPr>
-        <w:t>the</w:t>
-      </w:r>
-      <w:proofErr w:type="spellEnd"/>
-      <w:r>
-        <w:rPr>
-          <w:rStyle w:val="Gl"/>
-          <w:b w:val="0"/>
-          <w:bCs w:val="0"/>
-          <w:sz w:val="22"/>
-          <w:szCs w:val="22"/>
-        </w:rPr>
-        <w:t xml:space="preserve"> </w:t>
-      </w:r>
-      <w:proofErr w:type="spellStart"/>
-      <w:r>
-        <w:rPr>
-          <w:rStyle w:val="Gl"/>
-          <w:b w:val="0"/>
-          <w:bCs w:val="0"/>
-          <w:sz w:val="22"/>
-          <w:szCs w:val="22"/>
-        </w:rPr>
-        <w:t>first</w:t>
-      </w:r>
-      <w:proofErr w:type="spellEnd"/>
-      <w:r>
-        <w:rPr>
-          <w:rStyle w:val="Gl"/>
-          <w:b w:val="0"/>
-          <w:bCs w:val="0"/>
-          <w:sz w:val="22"/>
-          <w:szCs w:val="22"/>
-        </w:rPr>
-        <w:t xml:space="preserve"> </w:t>
-      </w:r>
-      <w:proofErr w:type="spellStart"/>
-      <w:r>
-        <w:rPr>
-          <w:rStyle w:val="Gl"/>
-          <w:b w:val="0"/>
-          <w:bCs w:val="0"/>
-          <w:sz w:val="22"/>
-          <w:szCs w:val="22"/>
-        </w:rPr>
-        <w:t>draft</w:t>
-      </w:r>
-      <w:proofErr w:type="spellEnd"/>
-      <w:r>
-        <w:rPr>
-          <w:rStyle w:val="Gl"/>
-          <w:b w:val="0"/>
-          <w:bCs w:val="0"/>
-          <w:sz w:val="22"/>
-          <w:szCs w:val="22"/>
-        </w:rPr>
-        <w:t xml:space="preserve"> of </w:t>
-      </w:r>
-      <w:proofErr w:type="spellStart"/>
-      <w:r>
-        <w:rPr>
-          <w:rStyle w:val="Gl"/>
-          <w:b w:val="0"/>
-          <w:bCs w:val="0"/>
-          <w:sz w:val="22"/>
-          <w:szCs w:val="22"/>
-        </w:rPr>
-        <w:t>the</w:t>
-      </w:r>
-      <w:proofErr w:type="spellEnd"/>
-      <w:r>
-        <w:rPr>
-          <w:rStyle w:val="Gl"/>
-          <w:b w:val="0"/>
-          <w:bCs w:val="0"/>
-          <w:sz w:val="22"/>
-          <w:szCs w:val="22"/>
-        </w:rPr>
-        <w:t xml:space="preserve"> </w:t>
-      </w:r>
-      <w:proofErr w:type="spellStart"/>
-      <w:r>
-        <w:rPr>
-          <w:rStyle w:val="Gl"/>
-          <w:b w:val="0"/>
-          <w:bCs w:val="0"/>
-          <w:sz w:val="22"/>
-          <w:szCs w:val="22"/>
-        </w:rPr>
-        <w:t>manuscript</w:t>
-      </w:r>
-      <w:proofErr w:type="spellEnd"/>
-      <w:r>
-        <w:rPr>
-          <w:rStyle w:val="Gl"/>
-          <w:b w:val="0"/>
-          <w:bCs w:val="0"/>
-          <w:sz w:val="22"/>
-          <w:szCs w:val="22"/>
-        </w:rPr>
-        <w:t>.</w:t>
+          <w:lang w:val="en-US"/>
+        </w:rPr>
+        <w:t>Responsible for the conceptualization of the study, research design, planning of the data collection process, data analysis, and writing the first draft of the manuscript.</w:t>
       </w:r>
     </w:p>
     <w:p>
@@ -2324,6 +1830,7 @@
           <w:bCs w:val="0"/>
           <w:sz w:val="22"/>
           <w:szCs w:val="22"/>
+          <w:lang w:val="en-US"/>
         </w:rPr>
       </w:pPr>
       <w:r>
@@ -2331,6 +1838,7 @@
           <w:rStyle w:val="Gl"/>
           <w:sz w:val="22"/>
           <w:szCs w:val="22"/>
+          <w:lang w:val="en-US"/>
         </w:rPr>
         <w:t xml:space="preserve">Author </w:t>
       </w:r>
@@ -2339,6 +1847,7 @@
           <w:rStyle w:val="Gl"/>
           <w:sz w:val="22"/>
           <w:szCs w:val="22"/>
+          <w:lang w:val="en-US"/>
         </w:rPr>
         <w:t>Name</w:t>
       </w:r>
@@ -2349,448 +1858,9 @@
           <w:bCs w:val="0"/>
           <w:sz w:val="22"/>
           <w:szCs w:val="22"/>
-        </w:rPr>
-        <w:t xml:space="preserve">: </w:t>
-      </w:r>
-      <w:proofErr w:type="spellStart"/>
-      <w:r>
-        <w:rPr>
-          <w:rStyle w:val="Gl"/>
-          <w:b w:val="0"/>
-          <w:bCs w:val="0"/>
-          <w:sz w:val="22"/>
-          <w:szCs w:val="22"/>
-        </w:rPr>
-        <w:t>Contributed</w:t>
-      </w:r>
-      <w:proofErr w:type="spellEnd"/>
-      <w:r>
-        <w:rPr>
-          <w:rStyle w:val="Gl"/>
-          <w:b w:val="0"/>
-          <w:bCs w:val="0"/>
-          <w:sz w:val="22"/>
-          <w:szCs w:val="22"/>
-        </w:rPr>
-        <w:t xml:space="preserve"> </w:t>
-      </w:r>
-      <w:proofErr w:type="spellStart"/>
-      <w:r>
-        <w:rPr>
-          <w:rStyle w:val="Gl"/>
-          <w:b w:val="0"/>
-          <w:bCs w:val="0"/>
-          <w:sz w:val="22"/>
-          <w:szCs w:val="22"/>
-        </w:rPr>
-        <w:t>to</w:t>
-      </w:r>
-      <w:proofErr w:type="spellEnd"/>
-      <w:r>
-        <w:rPr>
-          <w:rStyle w:val="Gl"/>
-          <w:b w:val="0"/>
-          <w:bCs w:val="0"/>
-          <w:sz w:val="22"/>
-          <w:szCs w:val="22"/>
-        </w:rPr>
-        <w:t xml:space="preserve"> </w:t>
-      </w:r>
-      <w:proofErr w:type="spellStart"/>
-      <w:r>
-        <w:rPr>
-          <w:rStyle w:val="Gl"/>
-          <w:b w:val="0"/>
-          <w:bCs w:val="0"/>
-          <w:sz w:val="22"/>
-          <w:szCs w:val="22"/>
-        </w:rPr>
-        <w:t>the</w:t>
-      </w:r>
-      <w:proofErr w:type="spellEnd"/>
-      <w:r>
-        <w:rPr>
-          <w:rStyle w:val="Gl"/>
-          <w:b w:val="0"/>
-          <w:bCs w:val="0"/>
-          <w:sz w:val="22"/>
-          <w:szCs w:val="22"/>
-        </w:rPr>
-        <w:t xml:space="preserve"> </w:t>
-      </w:r>
-      <w:proofErr w:type="spellStart"/>
-      <w:r>
-        <w:rPr>
-          <w:rStyle w:val="Gl"/>
-          <w:b w:val="0"/>
-          <w:bCs w:val="0"/>
-          <w:sz w:val="22"/>
-          <w:szCs w:val="22"/>
-        </w:rPr>
-        <w:t>literature</w:t>
-      </w:r>
-      <w:proofErr w:type="spellEnd"/>
-      <w:r>
-        <w:rPr>
-          <w:rStyle w:val="Gl"/>
-          <w:b w:val="0"/>
-          <w:bCs w:val="0"/>
-          <w:sz w:val="22"/>
-          <w:szCs w:val="22"/>
-        </w:rPr>
-        <w:t xml:space="preserve"> </w:t>
-      </w:r>
-      <w:proofErr w:type="spellStart"/>
-      <w:r>
-        <w:rPr>
-          <w:rStyle w:val="Gl"/>
-          <w:b w:val="0"/>
-          <w:bCs w:val="0"/>
-          <w:sz w:val="22"/>
-          <w:szCs w:val="22"/>
-        </w:rPr>
-        <w:t>review</w:t>
-      </w:r>
-      <w:proofErr w:type="spellEnd"/>
-      <w:r>
-        <w:rPr>
-          <w:rStyle w:val="Gl"/>
-          <w:b w:val="0"/>
-          <w:bCs w:val="0"/>
-          <w:sz w:val="22"/>
-          <w:szCs w:val="22"/>
-        </w:rPr>
-        <w:t xml:space="preserve">, </w:t>
-      </w:r>
-      <w:proofErr w:type="spellStart"/>
-      <w:r>
-        <w:rPr>
-          <w:rStyle w:val="Gl"/>
-          <w:b w:val="0"/>
-          <w:bCs w:val="0"/>
-          <w:sz w:val="22"/>
-          <w:szCs w:val="22"/>
-        </w:rPr>
-        <w:t>participated</w:t>
-      </w:r>
-      <w:proofErr w:type="spellEnd"/>
-      <w:r>
-        <w:rPr>
-          <w:rStyle w:val="Gl"/>
-          <w:b w:val="0"/>
-          <w:bCs w:val="0"/>
-          <w:sz w:val="22"/>
-          <w:szCs w:val="22"/>
-        </w:rPr>
-        <w:t xml:space="preserve"> in </w:t>
-      </w:r>
-      <w:proofErr w:type="spellStart"/>
-      <w:r>
-        <w:rPr>
-          <w:rStyle w:val="Gl"/>
-          <w:b w:val="0"/>
-          <w:bCs w:val="0"/>
-          <w:sz w:val="22"/>
-          <w:szCs w:val="22"/>
-        </w:rPr>
-        <w:t>the</w:t>
-      </w:r>
-      <w:proofErr w:type="spellEnd"/>
-      <w:r>
-        <w:rPr>
-          <w:rStyle w:val="Gl"/>
-          <w:b w:val="0"/>
-          <w:bCs w:val="0"/>
-          <w:sz w:val="22"/>
-          <w:szCs w:val="22"/>
-        </w:rPr>
-        <w:t xml:space="preserve"> </w:t>
-      </w:r>
-      <w:proofErr w:type="gramStart"/>
-      <w:r>
-        <w:rPr>
-          <w:rStyle w:val="Gl"/>
-          <w:b w:val="0"/>
-          <w:bCs w:val="0"/>
-          <w:sz w:val="22"/>
-          <w:szCs w:val="22"/>
-        </w:rPr>
-        <w:t>data</w:t>
-      </w:r>
-      <w:proofErr w:type="gramEnd"/>
-      <w:r>
-        <w:rPr>
-          <w:rStyle w:val="Gl"/>
-          <w:b w:val="0"/>
-          <w:bCs w:val="0"/>
-          <w:sz w:val="22"/>
-          <w:szCs w:val="22"/>
-        </w:rPr>
-        <w:t xml:space="preserve"> </w:t>
-      </w:r>
-      <w:proofErr w:type="spellStart"/>
-      <w:r>
-        <w:rPr>
-          <w:rStyle w:val="Gl"/>
-          <w:b w:val="0"/>
-          <w:bCs w:val="0"/>
-          <w:sz w:val="22"/>
-          <w:szCs w:val="22"/>
-        </w:rPr>
-        <w:t>collection</w:t>
-      </w:r>
-      <w:proofErr w:type="spellEnd"/>
-      <w:r>
-        <w:rPr>
-          <w:rStyle w:val="Gl"/>
-          <w:b w:val="0"/>
-          <w:bCs w:val="0"/>
-          <w:sz w:val="22"/>
-          <w:szCs w:val="22"/>
-        </w:rPr>
-        <w:t xml:space="preserve"> </w:t>
-      </w:r>
-      <w:proofErr w:type="spellStart"/>
-      <w:r>
-        <w:rPr>
-          <w:rStyle w:val="Gl"/>
-          <w:b w:val="0"/>
-          <w:bCs w:val="0"/>
-          <w:sz w:val="22"/>
-          <w:szCs w:val="22"/>
-        </w:rPr>
-        <w:t>process</w:t>
-      </w:r>
-      <w:proofErr w:type="spellEnd"/>
-      <w:r>
-        <w:rPr>
-          <w:rStyle w:val="Gl"/>
-          <w:b w:val="0"/>
-          <w:bCs w:val="0"/>
-          <w:sz w:val="22"/>
-          <w:szCs w:val="22"/>
-        </w:rPr>
-        <w:t xml:space="preserve">, </w:t>
-      </w:r>
-      <w:proofErr w:type="spellStart"/>
-      <w:r>
-        <w:rPr>
-          <w:rStyle w:val="Gl"/>
-          <w:b w:val="0"/>
-          <w:bCs w:val="0"/>
-          <w:sz w:val="22"/>
-          <w:szCs w:val="22"/>
-        </w:rPr>
-        <w:t>interpreted</w:t>
-      </w:r>
-      <w:proofErr w:type="spellEnd"/>
-      <w:r>
-        <w:rPr>
-          <w:rStyle w:val="Gl"/>
-          <w:b w:val="0"/>
-          <w:bCs w:val="0"/>
-          <w:sz w:val="22"/>
-          <w:szCs w:val="22"/>
-        </w:rPr>
-        <w:t xml:space="preserve"> </w:t>
-      </w:r>
-      <w:proofErr w:type="spellStart"/>
-      <w:r>
-        <w:rPr>
-          <w:rStyle w:val="Gl"/>
-          <w:b w:val="0"/>
-          <w:bCs w:val="0"/>
-          <w:sz w:val="22"/>
-          <w:szCs w:val="22"/>
-        </w:rPr>
-        <w:t>the</w:t>
-      </w:r>
-      <w:proofErr w:type="spellEnd"/>
-      <w:r>
-        <w:rPr>
-          <w:rStyle w:val="Gl"/>
-          <w:b w:val="0"/>
-          <w:bCs w:val="0"/>
-          <w:sz w:val="22"/>
-          <w:szCs w:val="22"/>
-        </w:rPr>
-        <w:t xml:space="preserve"> </w:t>
-      </w:r>
-      <w:proofErr w:type="spellStart"/>
-      <w:r>
-        <w:rPr>
-          <w:rStyle w:val="Gl"/>
-          <w:b w:val="0"/>
-          <w:bCs w:val="0"/>
-          <w:sz w:val="22"/>
-          <w:szCs w:val="22"/>
-        </w:rPr>
-        <w:t>findings</w:t>
-      </w:r>
-      <w:proofErr w:type="spellEnd"/>
-      <w:r>
-        <w:rPr>
-          <w:rStyle w:val="Gl"/>
-          <w:b w:val="0"/>
-          <w:bCs w:val="0"/>
-          <w:sz w:val="22"/>
-          <w:szCs w:val="22"/>
-        </w:rPr>
-        <w:t xml:space="preserve">, </w:t>
-      </w:r>
-      <w:proofErr w:type="spellStart"/>
-      <w:r>
-        <w:rPr>
-          <w:rStyle w:val="Gl"/>
-          <w:b w:val="0"/>
-          <w:bCs w:val="0"/>
-          <w:sz w:val="22"/>
-          <w:szCs w:val="22"/>
-        </w:rPr>
-        <w:t>and</w:t>
-      </w:r>
-      <w:proofErr w:type="spellEnd"/>
-      <w:r>
-        <w:rPr>
-          <w:rStyle w:val="Gl"/>
-          <w:b w:val="0"/>
-          <w:bCs w:val="0"/>
-          <w:sz w:val="22"/>
-          <w:szCs w:val="22"/>
-        </w:rPr>
-        <w:t xml:space="preserve"> </w:t>
-      </w:r>
-      <w:proofErr w:type="spellStart"/>
-      <w:r>
-        <w:rPr>
-          <w:rStyle w:val="Gl"/>
-          <w:b w:val="0"/>
-          <w:bCs w:val="0"/>
-          <w:sz w:val="22"/>
-          <w:szCs w:val="22"/>
-        </w:rPr>
-        <w:t>contributed</w:t>
-      </w:r>
-      <w:proofErr w:type="spellEnd"/>
-      <w:r>
-        <w:rPr>
-          <w:rStyle w:val="Gl"/>
-          <w:b w:val="0"/>
-          <w:bCs w:val="0"/>
-          <w:sz w:val="22"/>
-          <w:szCs w:val="22"/>
-        </w:rPr>
-        <w:t xml:space="preserve"> </w:t>
-      </w:r>
-      <w:proofErr w:type="spellStart"/>
-      <w:r>
-        <w:rPr>
-          <w:rStyle w:val="Gl"/>
-          <w:b w:val="0"/>
-          <w:bCs w:val="0"/>
-          <w:sz w:val="22"/>
-          <w:szCs w:val="22"/>
-        </w:rPr>
-        <w:t>to</w:t>
-      </w:r>
-      <w:proofErr w:type="spellEnd"/>
-      <w:r>
-        <w:rPr>
-          <w:rStyle w:val="Gl"/>
-          <w:b w:val="0"/>
-          <w:bCs w:val="0"/>
-          <w:sz w:val="22"/>
-          <w:szCs w:val="22"/>
-        </w:rPr>
-        <w:t xml:space="preserve"> </w:t>
-      </w:r>
-      <w:proofErr w:type="spellStart"/>
-      <w:r>
-        <w:rPr>
-          <w:rStyle w:val="Gl"/>
-          <w:b w:val="0"/>
-          <w:bCs w:val="0"/>
-          <w:sz w:val="22"/>
-          <w:szCs w:val="22"/>
-        </w:rPr>
-        <w:t>the</w:t>
-      </w:r>
-      <w:proofErr w:type="spellEnd"/>
-      <w:r>
-        <w:rPr>
-          <w:rStyle w:val="Gl"/>
-          <w:b w:val="0"/>
-          <w:bCs w:val="0"/>
-          <w:sz w:val="22"/>
-          <w:szCs w:val="22"/>
-        </w:rPr>
-        <w:t xml:space="preserve"> </w:t>
-      </w:r>
-      <w:proofErr w:type="spellStart"/>
-      <w:r>
-        <w:rPr>
-          <w:rStyle w:val="Gl"/>
-          <w:b w:val="0"/>
-          <w:bCs w:val="0"/>
-          <w:sz w:val="22"/>
-          <w:szCs w:val="22"/>
-        </w:rPr>
-        <w:t>revision</w:t>
-      </w:r>
-      <w:proofErr w:type="spellEnd"/>
-      <w:r>
-        <w:rPr>
-          <w:rStyle w:val="Gl"/>
-          <w:b w:val="0"/>
-          <w:bCs w:val="0"/>
-          <w:sz w:val="22"/>
-          <w:szCs w:val="22"/>
-        </w:rPr>
-        <w:t xml:space="preserve"> of </w:t>
-      </w:r>
-      <w:proofErr w:type="spellStart"/>
-      <w:r>
-        <w:rPr>
-          <w:rStyle w:val="Gl"/>
-          <w:b w:val="0"/>
-          <w:bCs w:val="0"/>
-          <w:sz w:val="22"/>
-          <w:szCs w:val="22"/>
-        </w:rPr>
-        <w:t>the</w:t>
-      </w:r>
-      <w:proofErr w:type="spellEnd"/>
-      <w:r>
-        <w:rPr>
-          <w:rStyle w:val="Gl"/>
-          <w:b w:val="0"/>
-          <w:bCs w:val="0"/>
-          <w:sz w:val="22"/>
-          <w:szCs w:val="22"/>
-        </w:rPr>
-        <w:t xml:space="preserve"> </w:t>
-      </w:r>
-      <w:proofErr w:type="spellStart"/>
-      <w:r>
-        <w:rPr>
-          <w:rStyle w:val="Gl"/>
-          <w:b w:val="0"/>
-          <w:bCs w:val="0"/>
-          <w:sz w:val="22"/>
-          <w:szCs w:val="22"/>
-        </w:rPr>
-        <w:t>manuscript</w:t>
-      </w:r>
-      <w:proofErr w:type="spellEnd"/>
-      <w:r>
-        <w:rPr>
-          <w:rStyle w:val="Gl"/>
-          <w:b w:val="0"/>
-          <w:bCs w:val="0"/>
-          <w:sz w:val="22"/>
-          <w:szCs w:val="22"/>
-        </w:rPr>
-        <w:t>.</w:t>
+          <w:lang w:val="en-US"/>
+        </w:rPr>
+        <w:t>: Contributed to the literature review, participated in the data collection process, interpreted the findings, and contributed to the revision of the manuscript.</w:t>
       </w:r>
     </w:p>
     <w:p>
@@ -2811,6 +1881,7 @@
           <w:bCs w:val="0"/>
           <w:sz w:val="22"/>
           <w:szCs w:val="22"/>
+          <w:lang w:val="en-US"/>
         </w:rPr>
       </w:pPr>
       <w:r>
@@ -2818,6 +1889,7 @@
           <w:rStyle w:val="Gl"/>
           <w:sz w:val="22"/>
           <w:szCs w:val="22"/>
+          <w:lang w:val="en-US"/>
         </w:rPr>
         <w:t xml:space="preserve">Author </w:t>
       </w:r>
@@ -2826,6 +1898,7 @@
           <w:rStyle w:val="Gl"/>
           <w:sz w:val="22"/>
           <w:szCs w:val="22"/>
+          <w:lang w:val="en-US"/>
         </w:rPr>
         <w:t>Name</w:t>
       </w:r>
@@ -2834,6 +1907,7 @@
           <w:rStyle w:val="Gl"/>
           <w:sz w:val="22"/>
           <w:szCs w:val="22"/>
+          <w:lang w:val="en-US"/>
         </w:rPr>
         <w:t>:</w:t>
       </w:r>
@@ -2844,516 +1918,148 @@
           <w:bCs w:val="0"/>
           <w:sz w:val="22"/>
           <w:szCs w:val="22"/>
+          <w:lang w:val="en-US"/>
+        </w:rPr>
+        <w:t xml:space="preserve"> Responsible for the verification of data analysis, methodological supervision, preparation of the final version of the manuscript, and technical editing prior to publication.</w:t>
+      </w:r>
+    </w:p>
+    <w:p>
+      <w:pPr>
+        <w:spacing w:after="120"/>
+        <w:jc w:val="both"/>
+        <w:rPr>
+          <w:rFonts w:ascii="Times New Roman" w:hAnsi="Times New Roman" w:cs="Times New Roman"/>
+          <w:b/>
+          <w:bCs/>
+          <w:lang w:val="en-US"/>
+        </w:rPr>
+      </w:pPr>
+    </w:p>
+    <w:p>
+      <w:pPr>
+        <w:spacing w:after="120"/>
+        <w:jc w:val="both"/>
+        <w:rPr>
+          <w:rFonts w:ascii="Times New Roman" w:hAnsi="Times New Roman" w:cs="Times New Roman"/>
+          <w:b/>
+          <w:bCs/>
+          <w:lang w:val="en-US"/>
+        </w:rPr>
+      </w:pPr>
+      <w:r>
+        <w:rPr>
+          <w:rFonts w:ascii="Times New Roman" w:hAnsi="Times New Roman" w:cs="Times New Roman"/>
+          <w:b/>
+          <w:bCs/>
+          <w:lang w:val="en-US"/>
+        </w:rPr>
+        <w:t>Use of Artificial Intelligence (</w:t>
+      </w:r>
+      <w:r>
+        <w:rPr>
+          <w:rFonts w:ascii="Times New Roman" w:hAnsi="Times New Roman" w:cs="Times New Roman"/>
+          <w:b/>
+          <w:bCs/>
+          <w:color w:val="EE0000"/>
+          <w:lang w:val="en-US"/>
+        </w:rPr>
+        <w:t>Mandatory</w:t>
+      </w:r>
+      <w:r>
+        <w:rPr>
+          <w:rFonts w:ascii="Times New Roman" w:hAnsi="Times New Roman" w:cs="Times New Roman"/>
+          <w:b/>
+          <w:bCs/>
+          <w:lang w:val="en-US"/>
+        </w:rPr>
+        <w:t>)</w:t>
+      </w:r>
+    </w:p>
+    <w:p>
+      <w:pPr>
+        <w:spacing w:after="120"/>
+        <w:jc w:val="both"/>
+        <w:rPr>
+          <w:rFonts w:ascii="Times New Roman" w:hAnsi="Times New Roman" w:cs="Times New Roman"/>
+          <w:lang w:val="en-US"/>
+        </w:rPr>
+      </w:pPr>
+      <w:r>
+        <w:rPr>
+          <w:rFonts w:ascii="Times New Roman" w:hAnsi="Times New Roman" w:cs="Times New Roman"/>
+          <w:lang w:val="en-US"/>
+        </w:rPr>
+        <w:t xml:space="preserve">The journal does not restrict the use of artificial intelligence (AI) </w:t>
+      </w:r>
+      <w:r>
+        <w:rPr>
+          <w:rFonts w:ascii="Times New Roman" w:hAnsi="Times New Roman" w:cs="Times New Roman"/>
+          <w:lang w:val="en-US"/>
+        </w:rPr>
+        <w:t>tools but</w:t>
+      </w:r>
+      <w:r>
+        <w:rPr>
+          <w:rFonts w:ascii="Times New Roman" w:hAnsi="Times New Roman" w:cs="Times New Roman"/>
+          <w:lang w:val="en-US"/>
+        </w:rPr>
+        <w:t xml:space="preserve"> requires full transparency. Authors must declare whether AI tools were utilized during the preparation of the manuscript.</w:t>
+      </w:r>
+      <w:r>
+        <w:rPr>
+          <w:rFonts w:ascii="Times New Roman" w:hAnsi="Times New Roman" w:cs="Times New Roman"/>
+          <w:lang w:val="en-US"/>
         </w:rPr>
         <w:t xml:space="preserve"> </w:t>
       </w:r>
-      <w:proofErr w:type="spellStart"/>
-      <w:r>
-        <w:rPr>
-          <w:rStyle w:val="Gl"/>
-          <w:b w:val="0"/>
-          <w:bCs w:val="0"/>
-          <w:sz w:val="22"/>
-          <w:szCs w:val="22"/>
-        </w:rPr>
-        <w:t>Responsible</w:t>
-      </w:r>
-      <w:proofErr w:type="spellEnd"/>
-      <w:r>
-        <w:rPr>
-          <w:rStyle w:val="Gl"/>
-          <w:b w:val="0"/>
-          <w:bCs w:val="0"/>
-          <w:sz w:val="22"/>
-          <w:szCs w:val="22"/>
-        </w:rPr>
-        <w:t xml:space="preserve"> </w:t>
-      </w:r>
-      <w:proofErr w:type="spellStart"/>
-      <w:r>
-        <w:rPr>
-          <w:rStyle w:val="Gl"/>
-          <w:b w:val="0"/>
-          <w:bCs w:val="0"/>
-          <w:sz w:val="22"/>
-          <w:szCs w:val="22"/>
-        </w:rPr>
-        <w:t>for</w:t>
-      </w:r>
-      <w:proofErr w:type="spellEnd"/>
-      <w:r>
-        <w:rPr>
-          <w:rStyle w:val="Gl"/>
-          <w:b w:val="0"/>
-          <w:bCs w:val="0"/>
-          <w:sz w:val="22"/>
-          <w:szCs w:val="22"/>
-        </w:rPr>
-        <w:t xml:space="preserve"> </w:t>
-      </w:r>
-      <w:proofErr w:type="spellStart"/>
-      <w:r>
-        <w:rPr>
-          <w:rStyle w:val="Gl"/>
-          <w:b w:val="0"/>
-          <w:bCs w:val="0"/>
-          <w:sz w:val="22"/>
-          <w:szCs w:val="22"/>
-        </w:rPr>
-        <w:t>the</w:t>
-      </w:r>
-      <w:proofErr w:type="spellEnd"/>
-      <w:r>
-        <w:rPr>
-          <w:rStyle w:val="Gl"/>
-          <w:b w:val="0"/>
-          <w:bCs w:val="0"/>
-          <w:sz w:val="22"/>
-          <w:szCs w:val="22"/>
-        </w:rPr>
-        <w:t xml:space="preserve"> </w:t>
-      </w:r>
-      <w:proofErr w:type="spellStart"/>
-      <w:r>
-        <w:rPr>
-          <w:rStyle w:val="Gl"/>
-          <w:b w:val="0"/>
-          <w:bCs w:val="0"/>
-          <w:sz w:val="22"/>
-          <w:szCs w:val="22"/>
-        </w:rPr>
-        <w:t>verification</w:t>
-      </w:r>
-      <w:proofErr w:type="spellEnd"/>
-      <w:r>
-        <w:rPr>
-          <w:rStyle w:val="Gl"/>
-          <w:b w:val="0"/>
-          <w:bCs w:val="0"/>
-          <w:sz w:val="22"/>
-          <w:szCs w:val="22"/>
-        </w:rPr>
-        <w:t xml:space="preserve"> of </w:t>
-      </w:r>
-      <w:proofErr w:type="gramStart"/>
-      <w:r>
-        <w:rPr>
-          <w:rStyle w:val="Gl"/>
-          <w:b w:val="0"/>
-          <w:bCs w:val="0"/>
-          <w:sz w:val="22"/>
-          <w:szCs w:val="22"/>
-        </w:rPr>
-        <w:t>data</w:t>
-      </w:r>
-      <w:proofErr w:type="gramEnd"/>
-      <w:r>
-        <w:rPr>
-          <w:rStyle w:val="Gl"/>
-          <w:b w:val="0"/>
-          <w:bCs w:val="0"/>
-          <w:sz w:val="22"/>
-          <w:szCs w:val="22"/>
-        </w:rPr>
-        <w:t xml:space="preserve"> </w:t>
-      </w:r>
-      <w:proofErr w:type="spellStart"/>
-      <w:r>
-        <w:rPr>
-          <w:rStyle w:val="Gl"/>
-          <w:b w:val="0"/>
-          <w:bCs w:val="0"/>
-          <w:sz w:val="22"/>
-          <w:szCs w:val="22"/>
-        </w:rPr>
-        <w:t>analysis</w:t>
-      </w:r>
-      <w:proofErr w:type="spellEnd"/>
-      <w:r>
-        <w:rPr>
-          <w:rStyle w:val="Gl"/>
-          <w:b w:val="0"/>
-          <w:bCs w:val="0"/>
-          <w:sz w:val="22"/>
-          <w:szCs w:val="22"/>
-        </w:rPr>
-        <w:t xml:space="preserve">, </w:t>
-      </w:r>
-      <w:proofErr w:type="spellStart"/>
-      <w:r>
-        <w:rPr>
-          <w:rStyle w:val="Gl"/>
-          <w:b w:val="0"/>
-          <w:bCs w:val="0"/>
-          <w:sz w:val="22"/>
-          <w:szCs w:val="22"/>
-        </w:rPr>
-        <w:t>methodological</w:t>
-      </w:r>
-      <w:proofErr w:type="spellEnd"/>
-      <w:r>
-        <w:rPr>
-          <w:rStyle w:val="Gl"/>
-          <w:b w:val="0"/>
-          <w:bCs w:val="0"/>
-          <w:sz w:val="22"/>
-          <w:szCs w:val="22"/>
-        </w:rPr>
-        <w:t xml:space="preserve"> </w:t>
-      </w:r>
-      <w:proofErr w:type="spellStart"/>
-      <w:r>
-        <w:rPr>
-          <w:rStyle w:val="Gl"/>
-          <w:b w:val="0"/>
-          <w:bCs w:val="0"/>
-          <w:sz w:val="22"/>
-          <w:szCs w:val="22"/>
-        </w:rPr>
-        <w:t>supervision</w:t>
-      </w:r>
-      <w:proofErr w:type="spellEnd"/>
-      <w:r>
-        <w:rPr>
-          <w:rStyle w:val="Gl"/>
-          <w:b w:val="0"/>
-          <w:bCs w:val="0"/>
-          <w:sz w:val="22"/>
-          <w:szCs w:val="22"/>
-        </w:rPr>
-        <w:t xml:space="preserve">, </w:t>
-      </w:r>
-      <w:proofErr w:type="spellStart"/>
-      <w:r>
-        <w:rPr>
-          <w:rStyle w:val="Gl"/>
-          <w:b w:val="0"/>
-          <w:bCs w:val="0"/>
-          <w:sz w:val="22"/>
-          <w:szCs w:val="22"/>
-        </w:rPr>
-        <w:t>preparation</w:t>
-      </w:r>
-      <w:proofErr w:type="spellEnd"/>
-      <w:r>
-        <w:rPr>
-          <w:rStyle w:val="Gl"/>
-          <w:b w:val="0"/>
-          <w:bCs w:val="0"/>
-          <w:sz w:val="22"/>
-          <w:szCs w:val="22"/>
-        </w:rPr>
-        <w:t xml:space="preserve"> of </w:t>
-      </w:r>
-      <w:proofErr w:type="spellStart"/>
-      <w:r>
-        <w:rPr>
-          <w:rStyle w:val="Gl"/>
-          <w:b w:val="0"/>
-          <w:bCs w:val="0"/>
-          <w:sz w:val="22"/>
-          <w:szCs w:val="22"/>
-        </w:rPr>
-        <w:t>the</w:t>
-      </w:r>
-      <w:proofErr w:type="spellEnd"/>
-      <w:r>
-        <w:rPr>
-          <w:rStyle w:val="Gl"/>
-          <w:b w:val="0"/>
-          <w:bCs w:val="0"/>
-          <w:sz w:val="22"/>
-          <w:szCs w:val="22"/>
-        </w:rPr>
-        <w:t xml:space="preserve"> final </w:t>
-      </w:r>
-      <w:proofErr w:type="spellStart"/>
-      <w:r>
-        <w:rPr>
-          <w:rStyle w:val="Gl"/>
-          <w:b w:val="0"/>
-          <w:bCs w:val="0"/>
-          <w:sz w:val="22"/>
-          <w:szCs w:val="22"/>
-        </w:rPr>
-        <w:t>version</w:t>
-      </w:r>
-      <w:proofErr w:type="spellEnd"/>
-      <w:r>
-        <w:rPr>
-          <w:rStyle w:val="Gl"/>
-          <w:b w:val="0"/>
-          <w:bCs w:val="0"/>
-          <w:sz w:val="22"/>
-          <w:szCs w:val="22"/>
-        </w:rPr>
-        <w:t xml:space="preserve"> of </w:t>
-      </w:r>
-      <w:proofErr w:type="spellStart"/>
-      <w:r>
-        <w:rPr>
-          <w:rStyle w:val="Gl"/>
-          <w:b w:val="0"/>
-          <w:bCs w:val="0"/>
-          <w:sz w:val="22"/>
-          <w:szCs w:val="22"/>
-        </w:rPr>
-        <w:t>the</w:t>
-      </w:r>
-      <w:proofErr w:type="spellEnd"/>
-      <w:r>
-        <w:rPr>
-          <w:rStyle w:val="Gl"/>
-          <w:b w:val="0"/>
-          <w:bCs w:val="0"/>
-          <w:sz w:val="22"/>
-          <w:szCs w:val="22"/>
-        </w:rPr>
-        <w:t xml:space="preserve"> </w:t>
-      </w:r>
-      <w:proofErr w:type="spellStart"/>
-      <w:r>
-        <w:rPr>
-          <w:rStyle w:val="Gl"/>
-          <w:b w:val="0"/>
-          <w:bCs w:val="0"/>
-          <w:sz w:val="22"/>
-          <w:szCs w:val="22"/>
-        </w:rPr>
-        <w:t>manuscript</w:t>
-      </w:r>
-      <w:proofErr w:type="spellEnd"/>
-      <w:r>
-        <w:rPr>
-          <w:rStyle w:val="Gl"/>
-          <w:b w:val="0"/>
-          <w:bCs w:val="0"/>
-          <w:sz w:val="22"/>
-          <w:szCs w:val="22"/>
-        </w:rPr>
-        <w:t xml:space="preserve">, </w:t>
-      </w:r>
-      <w:proofErr w:type="spellStart"/>
-      <w:r>
-        <w:rPr>
-          <w:rStyle w:val="Gl"/>
-          <w:b w:val="0"/>
-          <w:bCs w:val="0"/>
-          <w:sz w:val="22"/>
-          <w:szCs w:val="22"/>
-        </w:rPr>
-        <w:t>and</w:t>
-      </w:r>
-      <w:proofErr w:type="spellEnd"/>
-      <w:r>
-        <w:rPr>
-          <w:rStyle w:val="Gl"/>
-          <w:b w:val="0"/>
-          <w:bCs w:val="0"/>
-          <w:sz w:val="22"/>
-          <w:szCs w:val="22"/>
-        </w:rPr>
-        <w:t xml:space="preserve"> </w:t>
-      </w:r>
-      <w:proofErr w:type="spellStart"/>
-      <w:r>
-        <w:rPr>
-          <w:rStyle w:val="Gl"/>
-          <w:b w:val="0"/>
-          <w:bCs w:val="0"/>
-          <w:sz w:val="22"/>
-          <w:szCs w:val="22"/>
-        </w:rPr>
-        <w:t>technical</w:t>
-      </w:r>
-      <w:proofErr w:type="spellEnd"/>
-      <w:r>
-        <w:rPr>
-          <w:rStyle w:val="Gl"/>
-          <w:b w:val="0"/>
-          <w:bCs w:val="0"/>
-          <w:sz w:val="22"/>
-          <w:szCs w:val="22"/>
-        </w:rPr>
-        <w:t xml:space="preserve"> </w:t>
-      </w:r>
-      <w:proofErr w:type="spellStart"/>
-      <w:r>
-        <w:rPr>
-          <w:rStyle w:val="Gl"/>
-          <w:b w:val="0"/>
-          <w:bCs w:val="0"/>
-          <w:sz w:val="22"/>
-          <w:szCs w:val="22"/>
-        </w:rPr>
-        <w:t>editing</w:t>
-      </w:r>
-      <w:proofErr w:type="spellEnd"/>
-      <w:r>
-        <w:rPr>
-          <w:rStyle w:val="Gl"/>
-          <w:b w:val="0"/>
-          <w:bCs w:val="0"/>
-          <w:sz w:val="22"/>
-          <w:szCs w:val="22"/>
-        </w:rPr>
-        <w:t xml:space="preserve"> </w:t>
-      </w:r>
-      <w:proofErr w:type="spellStart"/>
-      <w:r>
-        <w:rPr>
-          <w:rStyle w:val="Gl"/>
-          <w:b w:val="0"/>
-          <w:bCs w:val="0"/>
-          <w:sz w:val="22"/>
-          <w:szCs w:val="22"/>
-        </w:rPr>
-        <w:t>prior</w:t>
-      </w:r>
-      <w:proofErr w:type="spellEnd"/>
-      <w:r>
-        <w:rPr>
-          <w:rStyle w:val="Gl"/>
-          <w:b w:val="0"/>
-          <w:bCs w:val="0"/>
-          <w:sz w:val="22"/>
-          <w:szCs w:val="22"/>
-        </w:rPr>
-        <w:t xml:space="preserve"> </w:t>
-      </w:r>
-      <w:proofErr w:type="spellStart"/>
-      <w:r>
-        <w:rPr>
-          <w:rStyle w:val="Gl"/>
-          <w:b w:val="0"/>
-          <w:bCs w:val="0"/>
-          <w:sz w:val="22"/>
-          <w:szCs w:val="22"/>
-        </w:rPr>
-        <w:t>to</w:t>
-      </w:r>
-      <w:proofErr w:type="spellEnd"/>
-      <w:r>
-        <w:rPr>
-          <w:rStyle w:val="Gl"/>
-          <w:b w:val="0"/>
-          <w:bCs w:val="0"/>
-          <w:sz w:val="22"/>
-          <w:szCs w:val="22"/>
-        </w:rPr>
-        <w:t xml:space="preserve"> </w:t>
-      </w:r>
-      <w:proofErr w:type="spellStart"/>
-      <w:r>
-        <w:rPr>
-          <w:rStyle w:val="Gl"/>
-          <w:b w:val="0"/>
-          <w:bCs w:val="0"/>
-          <w:sz w:val="22"/>
-          <w:szCs w:val="22"/>
-        </w:rPr>
-        <w:t>publication</w:t>
-      </w:r>
-      <w:proofErr w:type="spellEnd"/>
-      <w:r>
-        <w:rPr>
-          <w:rStyle w:val="Gl"/>
-          <w:b w:val="0"/>
-          <w:bCs w:val="0"/>
-          <w:sz w:val="22"/>
-          <w:szCs w:val="22"/>
-        </w:rPr>
-        <w:t>.</w:t>
-      </w:r>
-    </w:p>
-    <w:p>
-      <w:pPr>
-        <w:spacing w:after="120"/>
-        <w:jc w:val="both"/>
-        <w:rPr>
-          <w:rFonts w:ascii="Times New Roman" w:hAnsi="Times New Roman" w:cs="Times New Roman"/>
-          <w:b/>
-          <w:bCs/>
-          <w:lang w:val="en-US"/>
-        </w:rPr>
-      </w:pPr>
-    </w:p>
-    <w:p>
-      <w:pPr>
-        <w:spacing w:after="120"/>
-        <w:jc w:val="both"/>
-        <w:rPr>
-          <w:rFonts w:ascii="Times New Roman" w:hAnsi="Times New Roman" w:cs="Times New Roman"/>
-          <w:b/>
-          <w:bCs/>
-          <w:lang w:val="en-US"/>
-        </w:rPr>
-      </w:pPr>
-      <w:r>
-        <w:rPr>
-          <w:rFonts w:ascii="Times New Roman" w:hAnsi="Times New Roman" w:cs="Times New Roman"/>
-          <w:b/>
-          <w:bCs/>
-          <w:lang w:val="en-US"/>
-        </w:rPr>
-        <w:t>Use of Artificial Intelligence (</w:t>
-      </w:r>
-      <w:r>
-        <w:rPr>
-          <w:rFonts w:ascii="Times New Roman" w:hAnsi="Times New Roman" w:cs="Times New Roman"/>
-          <w:b/>
-          <w:bCs/>
-          <w:color w:val="EE0000"/>
-          <w:lang w:val="en-US"/>
-        </w:rPr>
-        <w:t>Mandatory</w:t>
-      </w:r>
-      <w:r>
-        <w:rPr>
-          <w:rFonts w:ascii="Times New Roman" w:hAnsi="Times New Roman" w:cs="Times New Roman"/>
-          <w:b/>
-          <w:bCs/>
-          <w:lang w:val="en-US"/>
-        </w:rPr>
-        <w:t>)</w:t>
-      </w:r>
-    </w:p>
-    <w:p>
-      <w:pPr>
-        <w:spacing w:after="120"/>
-        <w:jc w:val="both"/>
-        <w:rPr>
-          <w:rFonts w:ascii="Times New Roman" w:hAnsi="Times New Roman" w:cs="Times New Roman"/>
-          <w:lang w:val="en-US"/>
-        </w:rPr>
-      </w:pPr>
-      <w:r>
-        <w:rPr>
-          <w:rFonts w:ascii="Times New Roman" w:hAnsi="Times New Roman" w:cs="Times New Roman"/>
-          <w:lang w:val="en-US"/>
-        </w:rPr>
-        <w:t>If any artificial intelligence tools were used, authors should specify which tools were used and under what conditions.</w:t>
-      </w:r>
-      <w:r>
-        <w:rPr>
-          <w:rFonts w:ascii="Times New Roman" w:hAnsi="Times New Roman" w:cs="Times New Roman"/>
-          <w:lang w:val="en-US"/>
-        </w:rPr>
-        <w:br/>
-        <w:t>In cases where no artificial intelligence tools were used, the following statement may be included:</w:t>
-      </w:r>
-    </w:p>
-    <w:p>
-      <w:pPr>
-        <w:spacing w:after="120"/>
-        <w:jc w:val="both"/>
+      <w:r>
+        <w:rPr>
+          <w:rFonts w:ascii="Times New Roman" w:hAnsi="Times New Roman" w:cs="Times New Roman"/>
+          <w:b/>
+          <w:bCs/>
+          <w:lang w:val="en-US"/>
+        </w:rPr>
+        <w:t>If AI tools were used</w:t>
+      </w:r>
+      <w:r>
+        <w:rPr>
+          <w:rFonts w:ascii="Times New Roman" w:hAnsi="Times New Roman" w:cs="Times New Roman"/>
+          <w:lang w:val="en-US"/>
+        </w:rPr>
+        <w:t xml:space="preserve">, authors should specify the tool and its exact purpose (e.g., language editing, translation, data analysis). The following statement may be adapted and included: </w:t>
+      </w:r>
+      <w:r>
         <w:rPr>
           <w:rFonts w:ascii="Times New Roman" w:hAnsi="Times New Roman" w:cs="Times New Roman"/>
           <w:i/>
           <w:iCs/>
           <w:lang w:val="en-US"/>
         </w:rPr>
-      </w:pPr>
+        <w:t>"During the preparation of this work, the author(s) used [NAME OF TOOL] in order to [REASON, e.g., improve readability]. After using this tool/service, the author(s) reviewed and edited the content as needed and take(s) full responsibility for the final publication."</w:t>
+      </w:r>
+      <w:r>
+        <w:rPr>
+          <w:rFonts w:ascii="Times New Roman" w:hAnsi="Times New Roman" w:cs="Times New Roman"/>
+          <w:lang w:val="en-US"/>
+        </w:rPr>
+        <w:t xml:space="preserve"> </w:t>
+      </w:r>
+      <w:r>
+        <w:rPr>
+          <w:rFonts w:ascii="Times New Roman" w:hAnsi="Times New Roman" w:cs="Times New Roman"/>
+          <w:b/>
+          <w:bCs/>
+          <w:lang w:val="en-US"/>
+        </w:rPr>
+        <w:t>In cases where no AI tools were used</w:t>
+      </w:r>
+      <w:r>
+        <w:rPr>
+          <w:rFonts w:ascii="Times New Roman" w:hAnsi="Times New Roman" w:cs="Times New Roman"/>
+          <w:lang w:val="en-US"/>
+        </w:rPr>
+        <w:t xml:space="preserve">, the following statement must be included: </w:t>
+      </w:r>
       <w:r>
         <w:rPr>
           <w:rFonts w:ascii="Times New Roman" w:hAnsi="Times New Roman" w:cs="Times New Roman"/>
@@ -3361,7 +2067,7 @@
           <w:iCs/>
           <w:lang w:val="en-US"/>
         </w:rPr>
-        <w:t>“No artificial intelligence–based tools or applications were used in the preparation of this study. All content was produced by the author(s) in accordance with scientific research methods and academic ethical principles.”</w:t>
+        <w:t>"No artificial intelligence–based tools or applications were used in the preparation of this study. All content was produced by the author(s) in accordance with scientific research methods and academic ethical principles."</w:t>
       </w:r>
     </w:p>
     <w:p>
@@ -3403,16 +2109,7 @@
           <w:bCs/>
           <w:lang w:val="en-US"/>
         </w:rPr>
-        <w:t xml:space="preserve"> </w:t>
-      </w:r>
-      <w:r>
-        <w:rPr>
-          <w:rFonts w:ascii="Times New Roman" w:hAnsi="Times New Roman" w:cs="Times New Roman"/>
-          <w:b/>
-          <w:bCs/>
-          <w:lang w:val="en-US"/>
-        </w:rPr>
-        <w:t>(</w:t>
+        <w:t xml:space="preserve"> (</w:t>
       </w:r>
       <w:r>
         <w:rPr>
@@ -3513,79 +2210,17 @@
           <w:rFonts w:ascii="Times New Roman" w:hAnsi="Times New Roman" w:cs="Times New Roman"/>
           <w:i/>
           <w:iCs/>
-        </w:rPr>
-      </w:pPr>
-      <w:proofErr w:type="spellStart"/>
+          <w:lang w:val="en-US"/>
+        </w:rPr>
+      </w:pPr>
       <w:r>
         <w:rPr>
           <w:rFonts w:ascii="Times New Roman" w:hAnsi="Times New Roman" w:cs="Times New Roman"/>
           <w:i/>
           <w:iCs/>
-        </w:rPr>
-        <w:t>References</w:t>
-      </w:r>
-      <w:proofErr w:type="spellEnd"/>
-      <w:r>
-        <w:rPr>
-          <w:rFonts w:ascii="Times New Roman" w:hAnsi="Times New Roman" w:cs="Times New Roman"/>
-          <w:i/>
-          <w:iCs/>
-        </w:rPr>
-        <w:t xml:space="preserve"> </w:t>
-      </w:r>
-      <w:proofErr w:type="spellStart"/>
-      <w:r>
-        <w:rPr>
-          <w:rFonts w:ascii="Times New Roman" w:hAnsi="Times New Roman" w:cs="Times New Roman"/>
-          <w:i/>
-          <w:iCs/>
-        </w:rPr>
-        <w:t>must</w:t>
-      </w:r>
-      <w:proofErr w:type="spellEnd"/>
-      <w:r>
-        <w:rPr>
-          <w:rFonts w:ascii="Times New Roman" w:hAnsi="Times New Roman" w:cs="Times New Roman"/>
-          <w:i/>
-          <w:iCs/>
-        </w:rPr>
-        <w:t xml:space="preserve"> </w:t>
-      </w:r>
-      <w:proofErr w:type="spellStart"/>
-      <w:r>
-        <w:rPr>
-          <w:rFonts w:ascii="Times New Roman" w:hAnsi="Times New Roman" w:cs="Times New Roman"/>
-          <w:i/>
-          <w:iCs/>
-        </w:rPr>
-        <w:t>follow</w:t>
-      </w:r>
-      <w:proofErr w:type="spellEnd"/>
-      <w:r>
-        <w:rPr>
-          <w:rFonts w:ascii="Times New Roman" w:hAnsi="Times New Roman" w:cs="Times New Roman"/>
-          <w:i/>
-          <w:iCs/>
-        </w:rPr>
-        <w:t xml:space="preserve"> APA 7 </w:t>
-      </w:r>
-      <w:proofErr w:type="spellStart"/>
-      <w:r>
-        <w:rPr>
-          <w:rFonts w:ascii="Times New Roman" w:hAnsi="Times New Roman" w:cs="Times New Roman"/>
-          <w:i/>
-          <w:iCs/>
-        </w:rPr>
-        <w:t>standards</w:t>
-      </w:r>
-      <w:proofErr w:type="spellEnd"/>
-      <w:r>
-        <w:rPr>
-          <w:rFonts w:ascii="Times New Roman" w:hAnsi="Times New Roman" w:cs="Times New Roman"/>
-          <w:i/>
-          <w:iCs/>
-        </w:rPr>
-        <w:t>)</w:t>
+          <w:lang w:val="en-US"/>
+        </w:rPr>
+        <w:t>References must follow APA 7 standards)</w:t>
       </w:r>
     </w:p>
     <w:p>
@@ -3595,128 +2230,26 @@
         <w:rPr>
           <w:rFonts w:ascii="Times New Roman" w:hAnsi="Times New Roman" w:cs="Times New Roman"/>
           <w:color w:val="EE0000"/>
-        </w:rPr>
-      </w:pPr>
-      <w:proofErr w:type="spellStart"/>
+          <w:lang w:val="en-US"/>
+        </w:rPr>
+      </w:pPr>
       <w:r>
         <w:rPr>
           <w:rFonts w:ascii="Times New Roman" w:hAnsi="Times New Roman" w:cs="Times New Roman"/>
           <w:color w:val="EE0000"/>
-        </w:rPr>
-        <w:t>There</w:t>
-      </w:r>
-      <w:proofErr w:type="spellEnd"/>
-      <w:r>
+          <w:lang w:val="en-US"/>
+        </w:rPr>
+        <w:t>There must be one blank paragraph after each reference.</w:t>
+      </w:r>
+    </w:p>
+    <w:p>
+      <w:pPr>
+        <w:spacing w:after="120"/>
+        <w:jc w:val="both"/>
         <w:rPr>
           <w:rFonts w:ascii="Times New Roman" w:hAnsi="Times New Roman" w:cs="Times New Roman"/>
           <w:color w:val="EE0000"/>
-        </w:rPr>
-        <w:t xml:space="preserve"> </w:t>
-      </w:r>
-      <w:proofErr w:type="spellStart"/>
-      <w:r>
-        <w:rPr>
-          <w:rFonts w:ascii="Times New Roman" w:hAnsi="Times New Roman" w:cs="Times New Roman"/>
-          <w:color w:val="EE0000"/>
-        </w:rPr>
-        <w:t>must</w:t>
-      </w:r>
-      <w:proofErr w:type="spellEnd"/>
-      <w:r>
-        <w:rPr>
-          <w:rFonts w:ascii="Times New Roman" w:hAnsi="Times New Roman" w:cs="Times New Roman"/>
-          <w:color w:val="EE0000"/>
-        </w:rPr>
-        <w:t xml:space="preserve"> be </w:t>
-      </w:r>
-      <w:proofErr w:type="spellStart"/>
-      <w:r>
-        <w:rPr>
-          <w:rFonts w:ascii="Times New Roman" w:hAnsi="Times New Roman" w:cs="Times New Roman"/>
-          <w:color w:val="EE0000"/>
-        </w:rPr>
-        <w:t>one</w:t>
-      </w:r>
-      <w:proofErr w:type="spellEnd"/>
-      <w:r>
-        <w:rPr>
-          <w:rFonts w:ascii="Times New Roman" w:hAnsi="Times New Roman" w:cs="Times New Roman"/>
-          <w:color w:val="EE0000"/>
-        </w:rPr>
-        <w:t xml:space="preserve"> </w:t>
-      </w:r>
-      <w:proofErr w:type="spellStart"/>
-      <w:r>
-        <w:rPr>
-          <w:rFonts w:ascii="Times New Roman" w:hAnsi="Times New Roman" w:cs="Times New Roman"/>
-          <w:color w:val="EE0000"/>
-        </w:rPr>
-        <w:t>blank</w:t>
-      </w:r>
-      <w:proofErr w:type="spellEnd"/>
-      <w:r>
-        <w:rPr>
-          <w:rFonts w:ascii="Times New Roman" w:hAnsi="Times New Roman" w:cs="Times New Roman"/>
-          <w:color w:val="EE0000"/>
-        </w:rPr>
-        <w:t xml:space="preserve"> </w:t>
-      </w:r>
-      <w:proofErr w:type="spellStart"/>
-      <w:r>
-        <w:rPr>
-          <w:rFonts w:ascii="Times New Roman" w:hAnsi="Times New Roman" w:cs="Times New Roman"/>
-          <w:color w:val="EE0000"/>
-        </w:rPr>
-        <w:t>paragraph</w:t>
-      </w:r>
-      <w:proofErr w:type="spellEnd"/>
-      <w:r>
-        <w:rPr>
-          <w:rFonts w:ascii="Times New Roman" w:hAnsi="Times New Roman" w:cs="Times New Roman"/>
-          <w:color w:val="EE0000"/>
-        </w:rPr>
-        <w:t xml:space="preserve"> </w:t>
-      </w:r>
-      <w:proofErr w:type="spellStart"/>
-      <w:r>
-        <w:rPr>
-          <w:rFonts w:ascii="Times New Roman" w:hAnsi="Times New Roman" w:cs="Times New Roman"/>
-          <w:color w:val="EE0000"/>
-        </w:rPr>
-        <w:t>after</w:t>
-      </w:r>
-      <w:proofErr w:type="spellEnd"/>
-      <w:r>
-        <w:rPr>
-          <w:rFonts w:ascii="Times New Roman" w:hAnsi="Times New Roman" w:cs="Times New Roman"/>
-          <w:color w:val="EE0000"/>
-        </w:rPr>
-        <w:t xml:space="preserve"> </w:t>
-      </w:r>
-      <w:proofErr w:type="spellStart"/>
-      <w:r>
-        <w:rPr>
-          <w:rFonts w:ascii="Times New Roman" w:hAnsi="Times New Roman" w:cs="Times New Roman"/>
-          <w:color w:val="EE0000"/>
-        </w:rPr>
-        <w:t>each</w:t>
-      </w:r>
-      <w:proofErr w:type="spellEnd"/>
-      <w:r>
-        <w:rPr>
-          <w:rFonts w:ascii="Times New Roman" w:hAnsi="Times New Roman" w:cs="Times New Roman"/>
-          <w:color w:val="EE0000"/>
-        </w:rPr>
-        <w:t xml:space="preserve"> reference.</w:t>
-      </w:r>
-    </w:p>
-    <w:p>
-      <w:pPr>
-        <w:spacing w:after="120"/>
-        <w:jc w:val="both"/>
-        <w:rPr>
-          <w:rFonts w:ascii="Times New Roman" w:hAnsi="Times New Roman" w:cs="Times New Roman"/>
-          <w:color w:val="EE0000"/>
+          <w:lang w:val="en-US"/>
         </w:rPr>
       </w:pPr>
     </w:p>
@@ -3738,15 +2271,7 @@
             <w:bCs/>
             <w:lang w:val="en-US"/>
           </w:rPr>
-          <w:t>A</w:t>
-        </w:r>
-        <w:r>
-          <w:rPr>
-            <w:b/>
-            <w:bCs/>
-            <w:lang w:val="en-US"/>
-          </w:rPr>
-          <w:t>ppendix</w:t>
+          <w:t>Appendix</w:t>
         </w:r>
       </w:hyperlink>
       <w:r>

</xml_diff>